<commit_message>
updated the doc file and added gitignore
</commit_message>
<xml_diff>
--- a/Git command.docx
+++ b/Git command.docx
@@ -71,14 +71,14 @@
         <w:tblLook w:val="04A0" w:firstRow="1" w:lastRow="0" w:firstColumn="1" w:lastColumn="0" w:noHBand="0" w:noVBand="1"/>
       </w:tblPr>
       <w:tblGrid>
-        <w:gridCol w:w="3116"/>
-        <w:gridCol w:w="3117"/>
+        <w:gridCol w:w="3256"/>
+        <w:gridCol w:w="2977"/>
         <w:gridCol w:w="3117"/>
       </w:tblGrid>
       <w:tr>
         <w:tc>
           <w:tcPr>
-            <w:tcW w:w="3116" w:type="dxa"/>
+            <w:tcW w:w="3256" w:type="dxa"/>
           </w:tcPr>
           <w:p>
             <w:r>
@@ -88,7 +88,7 @@
         </w:tc>
         <w:tc>
           <w:tcPr>
-            <w:tcW w:w="3117" w:type="dxa"/>
+            <w:tcW w:w="2977" w:type="dxa"/>
           </w:tcPr>
           <w:p>
             <w:r>
@@ -110,55 +110,125 @@
       <w:tr>
         <w:tc>
           <w:tcPr>
-            <w:tcW w:w="3116" w:type="dxa"/>
-          </w:tcPr>
-          <w:p/>
+            <w:tcW w:w="3256" w:type="dxa"/>
+          </w:tcPr>
+          <w:p>
+            <w:r>
+              <w:t xml:space="preserve">git config –global </w:t>
+            </w:r>
+            <w:proofErr w:type="spellStart"/>
+            <w:proofErr w:type="gramStart"/>
+            <w:r>
+              <w:t>user.email</w:t>
+            </w:r>
+            <w:proofErr w:type="spellEnd"/>
+            <w:proofErr w:type="gramEnd"/>
+            <w:r>
+              <w:t xml:space="preserve"> “</w:t>
+            </w:r>
+            <w:proofErr w:type="spellStart"/>
+            <w:r>
+              <w:t>wasim</w:t>
+            </w:r>
+            <w:proofErr w:type="spellEnd"/>
+            <w:r>
+              <w:t xml:space="preserve"> khan”</w:t>
+            </w:r>
+          </w:p>
+        </w:tc>
+        <w:tc>
+          <w:tcPr>
+            <w:tcW w:w="2977" w:type="dxa"/>
+          </w:tcPr>
+          <w:p>
+            <w:r>
+              <w:t xml:space="preserve">Set the global username </w:t>
+            </w:r>
+          </w:p>
         </w:tc>
         <w:tc>
           <w:tcPr>
             <w:tcW w:w="3117" w:type="dxa"/>
           </w:tcPr>
-          <w:p/>
-        </w:tc>
-        <w:tc>
-          <w:tcPr>
-            <w:tcW w:w="3117" w:type="dxa"/>
-          </w:tcPr>
-          <w:p/>
+          <w:p>
+            <w:r>
+              <w:t>Configure your identity (one-time, global)</w:t>
+            </w:r>
+          </w:p>
         </w:tc>
       </w:tr>
       <w:tr>
         <w:tc>
           <w:tcPr>
-            <w:tcW w:w="3116" w:type="dxa"/>
-          </w:tcPr>
-          <w:p/>
+            <w:tcW w:w="3256" w:type="dxa"/>
+          </w:tcPr>
+          <w:p>
+            <w:r>
+              <w:t xml:space="preserve">Git config –global </w:t>
+            </w:r>
+            <w:proofErr w:type="spellStart"/>
+            <w:proofErr w:type="gramStart"/>
+            <w:r>
+              <w:t>user.email</w:t>
+            </w:r>
+            <w:proofErr w:type="spellEnd"/>
+            <w:proofErr w:type="gramEnd"/>
+            <w:r>
+              <w:t xml:space="preserve"> “xyz@email.com”</w:t>
+            </w:r>
+          </w:p>
+        </w:tc>
+        <w:tc>
+          <w:tcPr>
+            <w:tcW w:w="2977" w:type="dxa"/>
+          </w:tcPr>
+          <w:p>
+            <w:r>
+              <w:t>Set the global email</w:t>
+            </w:r>
+          </w:p>
         </w:tc>
         <w:tc>
           <w:tcPr>
             <w:tcW w:w="3117" w:type="dxa"/>
           </w:tcPr>
-          <w:p/>
-        </w:tc>
-        <w:tc>
-          <w:tcPr>
-            <w:tcW w:w="3117" w:type="dxa"/>
-          </w:tcPr>
-          <w:p/>
+          <w:p>
+            <w:r>
+              <w:t>One time setup</w:t>
+            </w:r>
+          </w:p>
         </w:tc>
       </w:tr>
       <w:tr>
         <w:tc>
           <w:tcPr>
-            <w:tcW w:w="3116" w:type="dxa"/>
-          </w:tcPr>
-          <w:p/>
-        </w:tc>
-        <w:tc>
-          <w:tcPr>
-            <w:tcW w:w="3117" w:type="dxa"/>
-          </w:tcPr>
-          <w:p/>
+            <w:tcW w:w="3256" w:type="dxa"/>
+          </w:tcPr>
+          <w:p>
+            <w:r>
+              <w:t xml:space="preserve">git config --global </w:t>
+            </w:r>
+            <w:proofErr w:type="spellStart"/>
+            <w:proofErr w:type="gramStart"/>
+            <w:r>
+              <w:t>core.autocrlf</w:t>
+            </w:r>
+            <w:proofErr w:type="spellEnd"/>
+            <w:proofErr w:type="gramEnd"/>
+            <w:r>
+              <w:t xml:space="preserve"> true</w:t>
+            </w:r>
+          </w:p>
+        </w:tc>
+        <w:tc>
+          <w:tcPr>
+            <w:tcW w:w="2977" w:type="dxa"/>
+          </w:tcPr>
+          <w:p>
+            <w:r>
+              <w:t>line-ending differences show up as noisy diffs on every file even when nothing actually changed</w:t>
+            </w:r>
+          </w:p>
         </w:tc>
         <w:tc>
           <w:tcPr>
@@ -170,13 +240,13 @@
       <w:tr>
         <w:tc>
           <w:tcPr>
-            <w:tcW w:w="3116" w:type="dxa"/>
+            <w:tcW w:w="3256" w:type="dxa"/>
           </w:tcPr>
           <w:p/>
         </w:tc>
         <w:tc>
           <w:tcPr>
-            <w:tcW w:w="3117" w:type="dxa"/>
+            <w:tcW w:w="2977" w:type="dxa"/>
           </w:tcPr>
           <w:p/>
         </w:tc>
@@ -190,13 +260,13 @@
       <w:tr>
         <w:tc>
           <w:tcPr>
-            <w:tcW w:w="3116" w:type="dxa"/>
+            <w:tcW w:w="3256" w:type="dxa"/>
           </w:tcPr>
           <w:p/>
         </w:tc>
         <w:tc>
           <w:tcPr>
-            <w:tcW w:w="3117" w:type="dxa"/>
+            <w:tcW w:w="2977" w:type="dxa"/>
           </w:tcPr>
           <w:p/>
         </w:tc>
@@ -826,7 +896,6 @@
   <w:style w:type="character" w:default="1" w:styleId="DefaultParagraphFont">
     <w:name w:val="Default Paragraph Font"/>
     <w:uiPriority w:val="1"/>
-    <w:semiHidden/>
     <w:unhideWhenUsed/>
   </w:style>
   <w:style w:type="table" w:default="1" w:styleId="TableNormal">

</xml_diff>

<commit_message>
some new command added for daily use
</commit_message>
<xml_diff>
--- a/Git command.docx
+++ b/Git command.docx
@@ -1,31 +1,53 @@
 
 <file path=word/document.xml><?xml version="1.0" encoding="utf-8"?>
-<w:document xmlns:wpc="http://schemas.microsoft.com/office/word/2010/wordprocessingCanvas" xmlns:cx="http://schemas.microsoft.com/office/drawing/2014/chartex" xmlns:cx1="http://schemas.microsoft.com/office/drawing/2015/9/8/chartex" xmlns:cx2="http://schemas.microsoft.com/office/drawing/2015/10/21/chartex" xmlns:cx3="http://schemas.microsoft.com/office/drawing/2016/5/9/chartex" xmlns:cx4="http://schemas.microsoft.com/office/drawing/2016/5/10/chartex" xmlns:cx5="http://schemas.microsoft.com/office/drawing/2016/5/11/chartex" xmlns:cx6="http://schemas.microsoft.com/office/drawing/2016/5/12/chartex" xmlns:cx7="http://schemas.microsoft.com/office/drawing/2016/5/13/chartex" xmlns:cx8="http://schemas.microsoft.com/office/drawing/2016/5/14/chartex" xmlns:mc="http://schemas.openxmlformats.org/markup-compatibility/2006" xmlns:aink="http://schemas.microsoft.com/office/drawing/2016/ink" xmlns:am3d="http://schemas.microsoft.com/office/drawing/2017/model3d" xmlns:o="urn:schemas-microsoft-com:office:office" xmlns:oel="http://schemas.microsoft.com/office/2019/extlst" xmlns:r="http://schemas.openxmlformats.org/officeDocument/2006/relationships" xmlns:m="http://schemas.openxmlformats.org/officeDocument/2006/math" xmlns:v="urn:schemas-microsoft-com:vml" xmlns:wp14="http://schemas.microsoft.com/office/word/2010/wordprocessingDrawing" xmlns:wp="http://schemas.openxmlformats.org/drawingml/2006/wordprocessingDrawing" xmlns:w10="urn:schemas-microsoft-com:office:word" xmlns:w="http://schemas.openxmlformats.org/wordprocessingml/2006/main" xmlns:w14="http://schemas.microsoft.com/office/word/2010/wordml" xmlns:w15="http://schemas.microsoft.com/office/word/2012/wordml" xmlns:w16cex="http://schemas.microsoft.com/office/word/2018/wordml/cex" xmlns:w16cid="http://schemas.microsoft.com/office/word/2016/wordml/cid" xmlns:w16="http://schemas.microsoft.com/office/word/2018/wordml" xmlns:w16du="http://schemas.microsoft.com/office/word/2023/wordml/word16du" xmlns:w16sdtdh="http://schemas.microsoft.com/office/word/2020/wordml/sdtdatahash" xmlns:w16sdtfl="http://schemas.microsoft.com/office/word/2024/wordml/sdtformatlock" xmlns:w16se="http://schemas.microsoft.com/office/word/2015/wordml/symex" xmlns:wpg="http://schemas.microsoft.com/office/word/2010/wordprocessingGroup" xmlns:wpi="http://schemas.microsoft.com/office/word/2010/wordprocessingInk" xmlns:wne="http://schemas.microsoft.com/office/word/2006/wordml" xmlns:wps="http://schemas.microsoft.com/office/word/2010/wordprocessingShape" mc:Ignorable="w14 w15 w16se w16cid w16 w16cex w16sdtdh w16sdtfl w16du wp14">
+<w:document xmlns:wpc="http://schemas.microsoft.com/office/word/2010/wordprocessingCanvas" xmlns:cx="http://schemas.microsoft.com/office/drawing/2014/chartex" xmlns:cx1="http://schemas.microsoft.com/office/drawing/2015/9/8/chartex" xmlns:cx2="http://schemas.microsoft.com/office/drawing/2015/10/21/chartex" xmlns:cx3="http://schemas.microsoft.com/office/drawing/2016/5/9/chartex" xmlns:cx4="http://schemas.microsoft.com/office/drawing/2016/5/10/chartex" xmlns:cx5="http://schemas.microsoft.com/office/drawing/2016/5/11/chartex" xmlns:cx6="http://schemas.microsoft.com/office/drawing/2016/5/12/chartex" xmlns:cx7="http://schemas.microsoft.com/office/drawing/2016/5/13/chartex" xmlns:cx8="http://schemas.microsoft.com/office/drawing/2016/5/14/chartex" xmlns:mc="http://schemas.openxmlformats.org/markup-compatibility/2006" xmlns:aink="http://schemas.microsoft.com/office/drawing/2016/ink" xmlns:am3d="http://schemas.microsoft.com/office/drawing/2017/model3d" xmlns:o="urn:schemas-microsoft-com:office:office" xmlns:oel="http://schemas.microsoft.com/office/2019/extlst" xmlns:r="http://schemas.openxmlformats.org/officeDocument/2006/relationships" xmlns:m="http://schemas.openxmlformats.org/officeDocument/2006/math" xmlns:v="urn:schemas-microsoft-com:vml" xmlns:wp14="http://schemas.microsoft.com/office/word/2010/wordprocessingDrawing" xmlns:wp="http://schemas.openxmlformats.org/drawingml/2006/wordprocessingDrawing" xmlns:w10="urn:schemas-microsoft-com:office:word" xmlns:w="http://schemas.openxmlformats.org/wordprocessingml/2006/main" xmlns:w14="http://schemas.microsoft.com/office/word/2010/wordml" xmlns:w15="http://schemas.microsoft.com/office/word/2012/wordml" xmlns:w16cei="http://schemas.microsoft.com/office/word/2026/wordml/cei" xmlns:w16cex="http://schemas.microsoft.com/office/word/2018/wordml/cex" xmlns:w16cid="http://schemas.microsoft.com/office/word/2016/wordml/cid" xmlns:w16="http://schemas.microsoft.com/office/word/2018/wordml" xmlns:w16du="http://schemas.microsoft.com/office/word/2023/wordml/word16du" xmlns:w16sdtdh="http://schemas.microsoft.com/office/word/2020/wordml/sdtdatahash" xmlns:w16sdtfl="http://schemas.microsoft.com/office/word/2024/wordml/sdtformatlock" xmlns:w16se="http://schemas.microsoft.com/office/word/2015/wordml/symex" xmlns:wpg="http://schemas.microsoft.com/office/word/2010/wordprocessingGroup" xmlns:wpi="http://schemas.microsoft.com/office/word/2010/wordprocessingInk" xmlns:wne="http://schemas.microsoft.com/office/word/2006/wordml" xmlns:wps="http://schemas.microsoft.com/office/word/2010/wordprocessingShape" mc:Ignorable="w14 w15 w16se w16cid w16 w16cex w16sdtdh w16sdtfl w16du wp14">
   <w:body>
     <w:p>
       <w:pPr>
         <w:spacing w:after="0"/>
         <w:jc w:val="center"/>
+        <w:rPr>
+          <w:sz w:val="22"/>
+          <w:szCs w:val="22"/>
+        </w:rPr>
       </w:pPr>
       <w:r>
+        <w:rPr>
+          <w:sz w:val="22"/>
+          <w:szCs w:val="22"/>
+        </w:rPr>
         <w:t>Git</w:t>
       </w:r>
     </w:p>
     <w:p>
       <w:pPr>
         <w:spacing w:after="0"/>
+        <w:rPr>
+          <w:sz w:val="22"/>
+          <w:szCs w:val="22"/>
+        </w:rPr>
       </w:pPr>
       <w:r>
+        <w:rPr>
+          <w:sz w:val="22"/>
+          <w:szCs w:val="22"/>
+        </w:rPr>
         <w:t>Git working flow:</w:t>
       </w:r>
     </w:p>
     <w:p>
       <w:pPr>
         <w:spacing w:after="0"/>
+        <w:rPr>
+          <w:sz w:val="22"/>
+          <w:szCs w:val="22"/>
+        </w:rPr>
       </w:pPr>
       <w:r>
         <w:rPr>
           <w:noProof/>
+          <w:sz w:val="22"/>
+          <w:szCs w:val="22"/>
         </w:rPr>
         <w:drawing>
           <wp:inline distT="0" distB="0" distL="0" distR="0" wp14:anchorId="2071AAEB" wp14:editId="69E56066">
@@ -81,7 +103,21 @@
             <w:tcW w:w="3256" w:type="dxa"/>
           </w:tcPr>
           <w:p>
-            <w:r>
+            <w:pPr>
+              <w:rPr>
+                <w:b/>
+                <w:bCs/>
+                <w:sz w:val="22"/>
+                <w:szCs w:val="22"/>
+              </w:rPr>
+            </w:pPr>
+            <w:r>
+              <w:rPr>
+                <w:b/>
+                <w:bCs/>
+                <w:sz w:val="22"/>
+                <w:szCs w:val="22"/>
+              </w:rPr>
               <w:t>Code</w:t>
             </w:r>
           </w:p>
@@ -91,7 +127,21 @@
             <w:tcW w:w="2977" w:type="dxa"/>
           </w:tcPr>
           <w:p>
-            <w:r>
+            <w:pPr>
+              <w:rPr>
+                <w:b/>
+                <w:bCs/>
+                <w:sz w:val="22"/>
+                <w:szCs w:val="22"/>
+              </w:rPr>
+            </w:pPr>
+            <w:r>
+              <w:rPr>
+                <w:b/>
+                <w:bCs/>
+                <w:sz w:val="22"/>
+                <w:szCs w:val="22"/>
+              </w:rPr>
               <w:t>Desc</w:t>
             </w:r>
           </w:p>
@@ -101,7 +151,21 @@
             <w:tcW w:w="3117" w:type="dxa"/>
           </w:tcPr>
           <w:p>
-            <w:r>
+            <w:pPr>
+              <w:rPr>
+                <w:b/>
+                <w:bCs/>
+                <w:sz w:val="22"/>
+                <w:szCs w:val="22"/>
+              </w:rPr>
+            </w:pPr>
+            <w:r>
+              <w:rPr>
+                <w:b/>
+                <w:bCs/>
+                <w:sz w:val="22"/>
+                <w:szCs w:val="22"/>
+              </w:rPr>
               <w:t>Remarks</w:t>
             </w:r>
           </w:p>
@@ -113,25 +177,51 @@
             <w:tcW w:w="3256" w:type="dxa"/>
           </w:tcPr>
           <w:p>
-            <w:r>
+            <w:pPr>
+              <w:rPr>
+                <w:sz w:val="22"/>
+                <w:szCs w:val="22"/>
+              </w:rPr>
+            </w:pPr>
+            <w:r>
+              <w:rPr>
+                <w:sz w:val="22"/>
+                <w:szCs w:val="22"/>
+              </w:rPr>
               <w:t xml:space="preserve">git config –global </w:t>
             </w:r>
             <w:proofErr w:type="spellStart"/>
             <w:proofErr w:type="gramStart"/>
             <w:r>
+              <w:rPr>
+                <w:sz w:val="22"/>
+                <w:szCs w:val="22"/>
+              </w:rPr>
               <w:t>user.email</w:t>
             </w:r>
             <w:proofErr w:type="spellEnd"/>
             <w:proofErr w:type="gramEnd"/>
             <w:r>
+              <w:rPr>
+                <w:sz w:val="22"/>
+                <w:szCs w:val="22"/>
+              </w:rPr>
               <w:t xml:space="preserve"> “</w:t>
             </w:r>
             <w:proofErr w:type="spellStart"/>
             <w:r>
+              <w:rPr>
+                <w:sz w:val="22"/>
+                <w:szCs w:val="22"/>
+              </w:rPr>
               <w:t>wasim</w:t>
             </w:r>
             <w:proofErr w:type="spellEnd"/>
             <w:r>
+              <w:rPr>
+                <w:sz w:val="22"/>
+                <w:szCs w:val="22"/>
+              </w:rPr>
               <w:t xml:space="preserve"> khan”</w:t>
             </w:r>
           </w:p>
@@ -141,7 +231,17 @@
             <w:tcW w:w="2977" w:type="dxa"/>
           </w:tcPr>
           <w:p>
-            <w:r>
+            <w:pPr>
+              <w:rPr>
+                <w:sz w:val="22"/>
+                <w:szCs w:val="22"/>
+              </w:rPr>
+            </w:pPr>
+            <w:r>
+              <w:rPr>
+                <w:sz w:val="22"/>
+                <w:szCs w:val="22"/>
+              </w:rPr>
               <w:t xml:space="preserve">Set the global username </w:t>
             </w:r>
           </w:p>
@@ -151,7 +251,17 @@
             <w:tcW w:w="3117" w:type="dxa"/>
           </w:tcPr>
           <w:p>
-            <w:r>
+            <w:pPr>
+              <w:rPr>
+                <w:sz w:val="22"/>
+                <w:szCs w:val="22"/>
+              </w:rPr>
+            </w:pPr>
+            <w:r>
+              <w:rPr>
+                <w:sz w:val="22"/>
+                <w:szCs w:val="22"/>
+              </w:rPr>
               <w:t>Configure your identity (one-time, global)</w:t>
             </w:r>
           </w:p>
@@ -163,17 +273,35 @@
             <w:tcW w:w="3256" w:type="dxa"/>
           </w:tcPr>
           <w:p>
-            <w:r>
+            <w:pPr>
+              <w:rPr>
+                <w:sz w:val="22"/>
+                <w:szCs w:val="22"/>
+              </w:rPr>
+            </w:pPr>
+            <w:r>
+              <w:rPr>
+                <w:sz w:val="22"/>
+                <w:szCs w:val="22"/>
+              </w:rPr>
               <w:t xml:space="preserve">Git config –global </w:t>
             </w:r>
             <w:proofErr w:type="spellStart"/>
             <w:proofErr w:type="gramStart"/>
             <w:r>
+              <w:rPr>
+                <w:sz w:val="22"/>
+                <w:szCs w:val="22"/>
+              </w:rPr>
               <w:t>user.email</w:t>
             </w:r>
             <w:proofErr w:type="spellEnd"/>
             <w:proofErr w:type="gramEnd"/>
             <w:r>
+              <w:rPr>
+                <w:sz w:val="22"/>
+                <w:szCs w:val="22"/>
+              </w:rPr>
               <w:t xml:space="preserve"> “xyz@email.com”</w:t>
             </w:r>
           </w:p>
@@ -183,7 +311,17 @@
             <w:tcW w:w="2977" w:type="dxa"/>
           </w:tcPr>
           <w:p>
-            <w:r>
+            <w:pPr>
+              <w:rPr>
+                <w:sz w:val="22"/>
+                <w:szCs w:val="22"/>
+              </w:rPr>
+            </w:pPr>
+            <w:r>
+              <w:rPr>
+                <w:sz w:val="22"/>
+                <w:szCs w:val="22"/>
+              </w:rPr>
               <w:t>Set the global email</w:t>
             </w:r>
           </w:p>
@@ -193,7 +331,17 @@
             <w:tcW w:w="3117" w:type="dxa"/>
           </w:tcPr>
           <w:p>
-            <w:r>
+            <w:pPr>
+              <w:rPr>
+                <w:sz w:val="22"/>
+                <w:szCs w:val="22"/>
+              </w:rPr>
+            </w:pPr>
+            <w:r>
+              <w:rPr>
+                <w:sz w:val="22"/>
+                <w:szCs w:val="22"/>
+              </w:rPr>
               <w:t>One time setup</w:t>
             </w:r>
           </w:p>
@@ -205,17 +353,35 @@
             <w:tcW w:w="3256" w:type="dxa"/>
           </w:tcPr>
           <w:p>
-            <w:r>
+            <w:pPr>
+              <w:rPr>
+                <w:sz w:val="22"/>
+                <w:szCs w:val="22"/>
+              </w:rPr>
+            </w:pPr>
+            <w:r>
+              <w:rPr>
+                <w:sz w:val="22"/>
+                <w:szCs w:val="22"/>
+              </w:rPr>
               <w:t xml:space="preserve">git config --global </w:t>
             </w:r>
             <w:proofErr w:type="spellStart"/>
             <w:proofErr w:type="gramStart"/>
             <w:r>
+              <w:rPr>
+                <w:sz w:val="22"/>
+                <w:szCs w:val="22"/>
+              </w:rPr>
               <w:t>core.autocrlf</w:t>
             </w:r>
             <w:proofErr w:type="spellEnd"/>
             <w:proofErr w:type="gramEnd"/>
             <w:r>
+              <w:rPr>
+                <w:sz w:val="22"/>
+                <w:szCs w:val="22"/>
+              </w:rPr>
               <w:t xml:space="preserve"> true</w:t>
             </w:r>
           </w:p>
@@ -225,16 +391,42 @@
             <w:tcW w:w="2977" w:type="dxa"/>
           </w:tcPr>
           <w:p>
-            <w:r>
-              <w:t>line-ending differences show up as noisy diffs on every file even when nothing actually changed</w:t>
-            </w:r>
+            <w:pPr>
+              <w:rPr>
+                <w:sz w:val="22"/>
+                <w:szCs w:val="22"/>
+              </w:rPr>
+            </w:pPr>
+            <w:r>
+              <w:rPr>
+                <w:sz w:val="22"/>
+                <w:szCs w:val="22"/>
+              </w:rPr>
+              <w:t xml:space="preserve">line-ending differences show up as noisy diffs on every file even when nothing </w:t>
+            </w:r>
+            <w:proofErr w:type="gramStart"/>
+            <w:r>
+              <w:rPr>
+                <w:sz w:val="22"/>
+                <w:szCs w:val="22"/>
+              </w:rPr>
+              <w:t>actually changed</w:t>
+            </w:r>
+            <w:proofErr w:type="gramEnd"/>
           </w:p>
         </w:tc>
         <w:tc>
           <w:tcPr>
             <w:tcW w:w="3117" w:type="dxa"/>
           </w:tcPr>
-          <w:p/>
+          <w:p>
+            <w:pPr>
+              <w:rPr>
+                <w:sz w:val="22"/>
+                <w:szCs w:val="22"/>
+              </w:rPr>
+            </w:pPr>
+          </w:p>
         </w:tc>
       </w:tr>
       <w:tr>
@@ -243,7 +435,17 @@
             <w:tcW w:w="3256" w:type="dxa"/>
           </w:tcPr>
           <w:p>
-            <w:r>
+            <w:pPr>
+              <w:rPr>
+                <w:sz w:val="22"/>
+                <w:szCs w:val="22"/>
+              </w:rPr>
+            </w:pPr>
+            <w:r>
+              <w:rPr>
+                <w:sz w:val="22"/>
+                <w:szCs w:val="22"/>
+              </w:rPr>
               <w:t>Git clone url</w:t>
             </w:r>
           </w:p>
@@ -253,7 +455,17 @@
             <w:tcW w:w="2977" w:type="dxa"/>
           </w:tcPr>
           <w:p>
-            <w:r>
+            <w:pPr>
+              <w:rPr>
+                <w:sz w:val="22"/>
+                <w:szCs w:val="22"/>
+              </w:rPr>
+            </w:pPr>
+            <w:r>
+              <w:rPr>
+                <w:sz w:val="22"/>
+                <w:szCs w:val="22"/>
+              </w:rPr>
               <w:t>Clone the repository</w:t>
             </w:r>
           </w:p>
@@ -263,15 +475,33 @@
             <w:tcW w:w="3117" w:type="dxa"/>
           </w:tcPr>
           <w:p>
-            <w:r>
+            <w:pPr>
+              <w:rPr>
+                <w:sz w:val="22"/>
+                <w:szCs w:val="22"/>
+              </w:rPr>
+            </w:pPr>
+            <w:r>
+              <w:rPr>
+                <w:sz w:val="22"/>
+                <w:szCs w:val="22"/>
+              </w:rPr>
               <w:t xml:space="preserve">From </w:t>
             </w:r>
             <w:proofErr w:type="spellStart"/>
             <w:r>
+              <w:rPr>
+                <w:sz w:val="22"/>
+                <w:szCs w:val="22"/>
+              </w:rPr>
               <w:t>github</w:t>
             </w:r>
             <w:proofErr w:type="spellEnd"/>
             <w:r>
+              <w:rPr>
+                <w:sz w:val="22"/>
+                <w:szCs w:val="22"/>
+              </w:rPr>
               <w:t xml:space="preserve"> repo</w:t>
             </w:r>
           </w:p>
@@ -282,25 +512,260 @@
           <w:tcPr>
             <w:tcW w:w="3256" w:type="dxa"/>
           </w:tcPr>
-          <w:p/>
+          <w:p>
+            <w:pPr>
+              <w:rPr>
+                <w:sz w:val="22"/>
+                <w:szCs w:val="22"/>
+              </w:rPr>
+            </w:pPr>
+            <w:r>
+              <w:rPr>
+                <w:sz w:val="22"/>
+                <w:szCs w:val="22"/>
+              </w:rPr>
+              <w:t xml:space="preserve">Git </w:t>
+            </w:r>
+            <w:proofErr w:type="gramStart"/>
+            <w:r>
+              <w:rPr>
+                <w:sz w:val="22"/>
+                <w:szCs w:val="22"/>
+              </w:rPr>
+              <w:t>add .</w:t>
+            </w:r>
+            <w:proofErr w:type="gramEnd"/>
+          </w:p>
         </w:tc>
         <w:tc>
           <w:tcPr>
             <w:tcW w:w="2977" w:type="dxa"/>
           </w:tcPr>
-          <w:p/>
+          <w:p>
+            <w:pPr>
+              <w:rPr>
+                <w:sz w:val="22"/>
+                <w:szCs w:val="22"/>
+              </w:rPr>
+            </w:pPr>
+            <w:r>
+              <w:rPr>
+                <w:sz w:val="22"/>
+                <w:szCs w:val="22"/>
+              </w:rPr>
+              <w:t>Add all the files to staging area</w:t>
+            </w:r>
+          </w:p>
         </w:tc>
         <w:tc>
           <w:tcPr>
             <w:tcW w:w="3117" w:type="dxa"/>
           </w:tcPr>
-          <w:p/>
+          <w:p>
+            <w:pPr>
+              <w:rPr>
+                <w:sz w:val="22"/>
+                <w:szCs w:val="22"/>
+              </w:rPr>
+            </w:pPr>
+          </w:p>
+        </w:tc>
+      </w:tr>
+      <w:tr>
+        <w:tc>
+          <w:tcPr>
+            <w:tcW w:w="3256" w:type="dxa"/>
+          </w:tcPr>
+          <w:p>
+            <w:pPr>
+              <w:rPr>
+                <w:sz w:val="22"/>
+                <w:szCs w:val="22"/>
+              </w:rPr>
+            </w:pPr>
+            <w:r>
+              <w:rPr>
+                <w:sz w:val="22"/>
+                <w:szCs w:val="22"/>
+              </w:rPr>
+              <w:t>Git add &lt;filename&gt;</w:t>
+            </w:r>
+          </w:p>
+        </w:tc>
+        <w:tc>
+          <w:tcPr>
+            <w:tcW w:w="2977" w:type="dxa"/>
+          </w:tcPr>
+          <w:p>
+            <w:pPr>
+              <w:rPr>
+                <w:sz w:val="22"/>
+                <w:szCs w:val="22"/>
+              </w:rPr>
+            </w:pPr>
+            <w:r>
+              <w:rPr>
+                <w:sz w:val="22"/>
+                <w:szCs w:val="22"/>
+              </w:rPr>
+              <w:t>Add only specific file to staging area by providing the file name</w:t>
+            </w:r>
+          </w:p>
+        </w:tc>
+        <w:tc>
+          <w:tcPr>
+            <w:tcW w:w="3117" w:type="dxa"/>
+          </w:tcPr>
+          <w:p>
+            <w:pPr>
+              <w:rPr>
+                <w:sz w:val="22"/>
+                <w:szCs w:val="22"/>
+              </w:rPr>
+            </w:pPr>
+          </w:p>
+          <w:p>
+            <w:pPr>
+              <w:rPr>
+                <w:sz w:val="22"/>
+                <w:szCs w:val="22"/>
+              </w:rPr>
+            </w:pPr>
+          </w:p>
+        </w:tc>
+      </w:tr>
+      <w:tr>
+        <w:tc>
+          <w:tcPr>
+            <w:tcW w:w="3256" w:type="dxa"/>
+          </w:tcPr>
+          <w:p>
+            <w:pPr>
+              <w:rPr>
+                <w:sz w:val="22"/>
+                <w:szCs w:val="22"/>
+              </w:rPr>
+            </w:pPr>
+            <w:r>
+              <w:rPr>
+                <w:sz w:val="22"/>
+                <w:szCs w:val="22"/>
+              </w:rPr>
+              <w:t>Git commit -m “&lt;commit msg&gt;”</w:t>
+            </w:r>
+          </w:p>
+        </w:tc>
+        <w:tc>
+          <w:tcPr>
+            <w:tcW w:w="2977" w:type="dxa"/>
+          </w:tcPr>
+          <w:p>
+            <w:pPr>
+              <w:rPr>
+                <w:sz w:val="22"/>
+                <w:szCs w:val="22"/>
+              </w:rPr>
+            </w:pPr>
+            <w:r>
+              <w:rPr>
+                <w:sz w:val="22"/>
+                <w:szCs w:val="22"/>
+              </w:rPr>
+              <w:t>Provide commit to local repo like it will create a history to git</w:t>
+            </w:r>
+          </w:p>
+        </w:tc>
+        <w:tc>
+          <w:tcPr>
+            <w:tcW w:w="3117" w:type="dxa"/>
+          </w:tcPr>
+          <w:p>
+            <w:pPr>
+              <w:rPr>
+                <w:sz w:val="22"/>
+                <w:szCs w:val="22"/>
+              </w:rPr>
+            </w:pPr>
+            <w:r>
+              <w:rPr>
+                <w:sz w:val="22"/>
+                <w:szCs w:val="22"/>
+              </w:rPr>
+              <w:t>It will not push to remote repo until push</w:t>
+            </w:r>
+          </w:p>
+        </w:tc>
+      </w:tr>
+      <w:tr>
+        <w:tc>
+          <w:tcPr>
+            <w:tcW w:w="3256" w:type="dxa"/>
+          </w:tcPr>
+          <w:p>
+            <w:pPr>
+              <w:rPr>
+                <w:sz w:val="22"/>
+                <w:szCs w:val="22"/>
+              </w:rPr>
+            </w:pPr>
+            <w:r>
+              <w:rPr>
+                <w:sz w:val="22"/>
+                <w:szCs w:val="22"/>
+              </w:rPr>
+              <w:t>Git push</w:t>
+            </w:r>
+          </w:p>
+        </w:tc>
+        <w:tc>
+          <w:tcPr>
+            <w:tcW w:w="2977" w:type="dxa"/>
+          </w:tcPr>
+          <w:p>
+            <w:pPr>
+              <w:rPr>
+                <w:sz w:val="22"/>
+                <w:szCs w:val="22"/>
+              </w:rPr>
+            </w:pPr>
+            <w:r>
+              <w:rPr>
+                <w:sz w:val="22"/>
+                <w:szCs w:val="22"/>
+              </w:rPr>
+              <w:t>Merge the local changes to remote repo</w:t>
+            </w:r>
+          </w:p>
+        </w:tc>
+        <w:tc>
+          <w:tcPr>
+            <w:tcW w:w="3117" w:type="dxa"/>
+          </w:tcPr>
+          <w:p>
+            <w:pPr>
+              <w:rPr>
+                <w:sz w:val="22"/>
+                <w:szCs w:val="22"/>
+              </w:rPr>
+            </w:pPr>
+            <w:r>
+              <w:rPr>
+                <w:sz w:val="22"/>
+                <w:szCs w:val="22"/>
+              </w:rPr>
+              <w:t>Add the changes to remote so that others can see the changes</w:t>
+            </w:r>
+          </w:p>
         </w:tc>
       </w:tr>
     </w:tbl>
     <w:p>
       <w:pPr>
         <w:spacing w:after="0"/>
+        <w:rPr>
+          <w:sz w:val="22"/>
+          <w:szCs w:val="22"/>
+        </w:rPr>
       </w:pPr>
     </w:p>
     <w:sectPr>
@@ -916,6 +1381,7 @@
   <w:style w:type="character" w:default="1" w:styleId="DefaultParagraphFont">
     <w:name w:val="Default Paragraph Font"/>
     <w:uiPriority w:val="1"/>
+    <w:semiHidden/>
     <w:unhideWhenUsed/>
   </w:style>
   <w:style w:type="table" w:default="1" w:styleId="TableNormal">

</xml_diff>

<commit_message>
add new branch called practice/commands and added one new command
</commit_message>
<xml_diff>
--- a/Git command.docx
+++ b/Git command.docx
@@ -755,6 +755,125 @@
               </w:rPr>
               <w:t>Add the changes to remote so that others can see the changes</w:t>
             </w:r>
+          </w:p>
+        </w:tc>
+      </w:tr>
+      <w:tr>
+        <w:tc>
+          <w:tcPr>
+            <w:tcW w:w="3256" w:type="dxa"/>
+          </w:tcPr>
+          <w:p>
+            <w:pPr>
+              <w:rPr>
+                <w:sz w:val="22"/>
+                <w:szCs w:val="22"/>
+              </w:rPr>
+            </w:pPr>
+            <w:r>
+              <w:rPr>
+                <w:sz w:val="22"/>
+                <w:szCs w:val="22"/>
+              </w:rPr>
+              <w:t>Git push -</w:t>
+            </w:r>
+            <w:proofErr w:type="gramStart"/>
+            <w:r>
+              <w:rPr>
+                <w:sz w:val="22"/>
+                <w:szCs w:val="22"/>
+              </w:rPr>
+              <w:t>u origin</w:t>
+            </w:r>
+            <w:proofErr w:type="gramEnd"/>
+            <w:r>
+              <w:rPr>
+                <w:sz w:val="22"/>
+                <w:szCs w:val="22"/>
+              </w:rPr>
+              <w:t xml:space="preserve"> &lt;branch name&gt;</w:t>
+            </w:r>
+          </w:p>
+        </w:tc>
+        <w:tc>
+          <w:tcPr>
+            <w:tcW w:w="2977" w:type="dxa"/>
+          </w:tcPr>
+          <w:p>
+            <w:pPr>
+              <w:rPr>
+                <w:sz w:val="22"/>
+                <w:szCs w:val="22"/>
+              </w:rPr>
+            </w:pPr>
+            <w:r>
+              <w:rPr>
+                <w:sz w:val="22"/>
+                <w:szCs w:val="22"/>
+              </w:rPr>
+              <w:t>Push the changes to specific branch by providing the branch name</w:t>
+            </w:r>
+          </w:p>
+        </w:tc>
+        <w:tc>
+          <w:tcPr>
+            <w:tcW w:w="3117" w:type="dxa"/>
+          </w:tcPr>
+          <w:p>
+            <w:pPr>
+              <w:rPr>
+                <w:sz w:val="22"/>
+                <w:szCs w:val="22"/>
+              </w:rPr>
+            </w:pPr>
+            <w:r>
+              <w:rPr>
+                <w:sz w:val="22"/>
+                <w:szCs w:val="22"/>
+              </w:rPr>
+              <w:t>Another way to push the changes in branch</w:t>
+            </w:r>
+          </w:p>
+        </w:tc>
+      </w:tr>
+      <w:tr>
+        <w:tc>
+          <w:tcPr>
+            <w:tcW w:w="3256" w:type="dxa"/>
+          </w:tcPr>
+          <w:p>
+            <w:pPr>
+              <w:rPr>
+                <w:sz w:val="22"/>
+                <w:szCs w:val="22"/>
+              </w:rPr>
+            </w:pPr>
+          </w:p>
+        </w:tc>
+        <w:tc>
+          <w:tcPr>
+            <w:tcW w:w="2977" w:type="dxa"/>
+          </w:tcPr>
+          <w:p>
+            <w:pPr>
+              <w:rPr>
+                <w:sz w:val="22"/>
+                <w:szCs w:val="22"/>
+              </w:rPr>
+            </w:pPr>
+          </w:p>
+        </w:tc>
+        <w:tc>
+          <w:tcPr>
+            <w:tcW w:w="3117" w:type="dxa"/>
+          </w:tcPr>
+          <w:p>
+            <w:pPr>
+              <w:rPr>
+                <w:sz w:val="22"/>
+                <w:szCs w:val="22"/>
+              </w:rPr>
+            </w:pPr>
           </w:p>
         </w:tc>
       </w:tr>

</xml_diff>

<commit_message>
new modification from home pc
</commit_message>
<xml_diff>
--- a/Git command.docx
+++ b/Git command.docx
@@ -28,9 +28,9 @@
           <w:noProof/>
         </w:rPr>
         <w:drawing>
-          <wp:inline distT="0" distB="0" distL="0" distR="0" wp14:anchorId="2071AAEB" wp14:editId="69E56066">
-            <wp:extent cx="2857500" cy="2631909"/>
-            <wp:effectExtent l="0" t="0" r="0" b="0"/>
+          <wp:inline distT="0" distB="0" distL="0" distR="0" wp14:anchorId="2071AAEB" wp14:editId="7C5DFFD7">
+            <wp:extent cx="3669475" cy="3379781"/>
+            <wp:effectExtent l="0" t="0" r="7620" b="0"/>
             <wp:docPr id="742684717" name="Picture 1"/>
             <wp:cNvGraphicFramePr>
               <a:graphicFrameLocks xmlns:a="http://schemas.openxmlformats.org/drawingml/2006/main" noChangeAspect="1"/>
@@ -51,7 +51,7 @@
                   <pic:spPr>
                     <a:xfrm>
                       <a:off x="0" y="0"/>
-                      <a:ext cx="2862970" cy="2636947"/>
+                      <a:ext cx="3684374" cy="3393504"/>
                     </a:xfrm>
                     <a:prstGeom prst="rect">
                       <a:avLst/>
@@ -114,7 +114,53 @@
           </w:tcPr>
           <w:p>
             <w:r>
-              <w:t xml:space="preserve">git config –global </w:t>
+              <w:t>git config –global user.</w:t>
+            </w:r>
+            <w:r>
+              <w:t>name</w:t>
+            </w:r>
+            <w:r>
+              <w:t xml:space="preserve"> “</w:t>
+            </w:r>
+            <w:proofErr w:type="spellStart"/>
+            <w:r>
+              <w:t>wasim</w:t>
+            </w:r>
+            <w:proofErr w:type="spellEnd"/>
+            <w:r>
+              <w:t xml:space="preserve"> khan”</w:t>
+            </w:r>
+          </w:p>
+        </w:tc>
+        <w:tc>
+          <w:tcPr>
+            <w:tcW w:w="2977" w:type="dxa"/>
+          </w:tcPr>
+          <w:p>
+            <w:r>
+              <w:t xml:space="preserve">Set the global username </w:t>
+            </w:r>
+          </w:p>
+        </w:tc>
+        <w:tc>
+          <w:tcPr>
+            <w:tcW w:w="3117" w:type="dxa"/>
+          </w:tcPr>
+          <w:p>
+            <w:r>
+              <w:t>Configure your identity (one-time, global)</w:t>
+            </w:r>
+          </w:p>
+        </w:tc>
+      </w:tr>
+      <w:tr>
+        <w:tc>
+          <w:tcPr>
+            <w:tcW w:w="3256" w:type="dxa"/>
+          </w:tcPr>
+          <w:p>
+            <w:r>
+              <w:t xml:space="preserve">Git config –global </w:t>
             </w:r>
             <w:proofErr w:type="spellStart"/>
             <w:proofErr w:type="gramStart"/>
@@ -124,15 +170,7 @@
             <w:proofErr w:type="spellEnd"/>
             <w:proofErr w:type="gramEnd"/>
             <w:r>
-              <w:t xml:space="preserve"> “</w:t>
-            </w:r>
-            <w:proofErr w:type="spellStart"/>
-            <w:r>
-              <w:t>wasim</w:t>
-            </w:r>
-            <w:proofErr w:type="spellEnd"/>
-            <w:r>
-              <w:t xml:space="preserve"> khan”</w:t>
+              <w:t xml:space="preserve"> “xyz@email.com”</w:t>
             </w:r>
           </w:p>
         </w:tc>
@@ -142,7 +180,7 @@
           </w:tcPr>
           <w:p>
             <w:r>
-              <w:t xml:space="preserve">Set the global username </w:t>
+              <w:t>Set the global email</w:t>
             </w:r>
           </w:p>
         </w:tc>
@@ -152,7 +190,7 @@
           </w:tcPr>
           <w:p>
             <w:r>
-              <w:t>Configure your identity (one-time, global)</w:t>
+              <w:t>One time setup</w:t>
             </w:r>
           </w:p>
         </w:tc>
@@ -164,17 +202,17 @@
           </w:tcPr>
           <w:p>
             <w:r>
-              <w:t xml:space="preserve">Git config –global </w:t>
+              <w:t xml:space="preserve">git config --global </w:t>
             </w:r>
             <w:proofErr w:type="spellStart"/>
             <w:proofErr w:type="gramStart"/>
             <w:r>
-              <w:t>user.email</w:t>
+              <w:t>core.autocrlf</w:t>
             </w:r>
             <w:proofErr w:type="spellEnd"/>
             <w:proofErr w:type="gramEnd"/>
             <w:r>
-              <w:t xml:space="preserve"> “xyz@email.com”</w:t>
+              <w:t xml:space="preserve"> true</w:t>
             </w:r>
           </w:p>
         </w:tc>
@@ -184,7 +222,7 @@
           </w:tcPr>
           <w:p>
             <w:r>
-              <w:t>Set the global email</w:t>
+              <w:t>line-ending differences show up as noisy diffs on every file even when nothing actually changed</w:t>
             </w:r>
           </w:p>
         </w:tc>
@@ -192,11 +230,7 @@
           <w:tcPr>
             <w:tcW w:w="3117" w:type="dxa"/>
           </w:tcPr>
-          <w:p>
-            <w:r>
-              <w:t>One time setup</w:t>
-            </w:r>
-          </w:p>
+          <w:p/>
         </w:tc>
       </w:tr>
       <w:tr>
@@ -206,17 +240,7 @@
           </w:tcPr>
           <w:p>
             <w:r>
-              <w:t xml:space="preserve">git config --global </w:t>
-            </w:r>
-            <w:proofErr w:type="spellStart"/>
-            <w:proofErr w:type="gramStart"/>
-            <w:r>
-              <w:t>core.autocrlf</w:t>
-            </w:r>
-            <w:proofErr w:type="spellEnd"/>
-            <w:proofErr w:type="gramEnd"/>
-            <w:r>
-              <w:t xml:space="preserve"> true</w:t>
+              <w:t>Git global –list</w:t>
             </w:r>
           </w:p>
         </w:tc>
@@ -226,7 +250,7 @@
           </w:tcPr>
           <w:p>
             <w:r>
-              <w:t>line-ending differences show up as noisy diffs on every file even when nothing actually changed</w:t>
+              <w:t>To see all the configuration</w:t>
             </w:r>
           </w:p>
         </w:tc>
@@ -234,7 +258,11 @@
           <w:tcPr>
             <w:tcW w:w="3117" w:type="dxa"/>
           </w:tcPr>
-          <w:p/>
+          <w:p>
+            <w:r>
+              <w:t>Show all set configuration</w:t>
+            </w:r>
+          </w:p>
         </w:tc>
       </w:tr>
       <w:tr>
@@ -916,6 +944,7 @@
   <w:style w:type="character" w:default="1" w:styleId="DefaultParagraphFont">
     <w:name w:val="Default Paragraph Font"/>
     <w:uiPriority w:val="1"/>
+    <w:semiHidden/>
     <w:unhideWhenUsed/>
   </w:style>
   <w:style w:type="table" w:default="1" w:styleId="TableNormal">

</xml_diff>

<commit_message>
new commands added from practice/commands branch
</commit_message>
<xml_diff>
--- a/Git command.docx
+++ b/Git command.docx
@@ -1,59 +1,40 @@
 
 <file path=word/document.xml><?xml version="1.0" encoding="utf-8"?>
-<w:document xmlns:wpc="http://schemas.microsoft.com/office/word/2010/wordprocessingCanvas" xmlns:cx="http://schemas.microsoft.com/office/drawing/2014/chartex" xmlns:cx1="http://schemas.microsoft.com/office/drawing/2015/9/8/chartex" xmlns:cx2="http://schemas.microsoft.com/office/drawing/2015/10/21/chartex" xmlns:cx3="http://schemas.microsoft.com/office/drawing/2016/5/9/chartex" xmlns:cx4="http://schemas.microsoft.com/office/drawing/2016/5/10/chartex" xmlns:cx5="http://schemas.microsoft.com/office/drawing/2016/5/11/chartex" xmlns:cx6="http://schemas.microsoft.com/office/drawing/2016/5/12/chartex" xmlns:cx7="http://schemas.microsoft.com/office/drawing/2016/5/13/chartex" xmlns:cx8="http://schemas.microsoft.com/office/drawing/2016/5/14/chartex" xmlns:mc="http://schemas.openxmlformats.org/markup-compatibility/2006" xmlns:aink="http://schemas.microsoft.com/office/drawing/2016/ink" xmlns:am3d="http://schemas.microsoft.com/office/drawing/2017/model3d" xmlns:o="urn:schemas-microsoft-com:office:office" xmlns:oel="http://schemas.microsoft.com/office/2019/extlst" xmlns:r="http://schemas.openxmlformats.org/officeDocument/2006/relationships" xmlns:m="http://schemas.openxmlformats.org/officeDocument/2006/math" xmlns:v="urn:schemas-microsoft-com:vml" xmlns:wp14="http://schemas.microsoft.com/office/word/2010/wordprocessingDrawing" xmlns:wp="http://schemas.openxmlformats.org/drawingml/2006/wordprocessingDrawing" xmlns:w10="urn:schemas-microsoft-com:office:word" xmlns:w="http://schemas.openxmlformats.org/wordprocessingml/2006/main" xmlns:w14="http://schemas.microsoft.com/office/word/2010/wordml" xmlns:w15="http://schemas.microsoft.com/office/word/2012/wordml" xmlns:w16cei="http://schemas.microsoft.com/office/word/2026/wordml/cei" xmlns:w16cex="http://schemas.microsoft.com/office/word/2018/wordml/cex" xmlns:w16cid="http://schemas.microsoft.com/office/word/2016/wordml/cid" xmlns:w16="http://schemas.microsoft.com/office/word/2018/wordml" xmlns:w16du="http://schemas.microsoft.com/office/word/2023/wordml/word16du" xmlns:w16sdtdh="http://schemas.microsoft.com/office/word/2020/wordml/sdtdatahash" xmlns:w16sdtfl="http://schemas.microsoft.com/office/word/2024/wordml/sdtformatlock" xmlns:w16se="http://schemas.microsoft.com/office/word/2015/wordml/symex" xmlns:wpg="http://schemas.microsoft.com/office/word/2010/wordprocessingGroup" xmlns:wpi="http://schemas.microsoft.com/office/word/2010/wordprocessingInk" xmlns:wne="http://schemas.microsoft.com/office/word/2006/wordml" xmlns:wps="http://schemas.microsoft.com/office/word/2010/wordprocessingShape" mc:Ignorable="w14 w15 w16se w16cid w16 w16cex w16sdtdh w16sdtfl w16du wp14">
+<w:document xmlns:wpc="http://schemas.microsoft.com/office/word/2010/wordprocessingCanvas" xmlns:cx="http://schemas.microsoft.com/office/drawing/2014/chartex" xmlns:cx1="http://schemas.microsoft.com/office/drawing/2015/9/8/chartex" xmlns:cx2="http://schemas.microsoft.com/office/drawing/2015/10/21/chartex" xmlns:cx3="http://schemas.microsoft.com/office/drawing/2016/5/9/chartex" xmlns:cx4="http://schemas.microsoft.com/office/drawing/2016/5/10/chartex" xmlns:cx5="http://schemas.microsoft.com/office/drawing/2016/5/11/chartex" xmlns:cx6="http://schemas.microsoft.com/office/drawing/2016/5/12/chartex" xmlns:cx7="http://schemas.microsoft.com/office/drawing/2016/5/13/chartex" xmlns:cx8="http://schemas.microsoft.com/office/drawing/2016/5/14/chartex" xmlns:mc="http://schemas.openxmlformats.org/markup-compatibility/2006" xmlns:aink="http://schemas.microsoft.com/office/drawing/2016/ink" xmlns:am3d="http://schemas.microsoft.com/office/drawing/2017/model3d" xmlns:o="urn:schemas-microsoft-com:office:office" xmlns:oel="http://schemas.microsoft.com/office/2019/extlst" xmlns:r="http://schemas.openxmlformats.org/officeDocument/2006/relationships" xmlns:m="http://schemas.openxmlformats.org/officeDocument/2006/math" xmlns:v="urn:schemas-microsoft-com:vml" xmlns:wp14="http://schemas.microsoft.com/office/word/2010/wordprocessingDrawing" xmlns:wp="http://schemas.openxmlformats.org/drawingml/2006/wordprocessingDrawing" xmlns:w10="urn:schemas-microsoft-com:office:word" xmlns:w="http://schemas.openxmlformats.org/wordprocessingml/2006/main" xmlns:w14="http://schemas.microsoft.com/office/word/2010/wordml" xmlns:w15="http://schemas.microsoft.com/office/word/2012/wordml" xmlns:w16cex="http://schemas.microsoft.com/office/word/2018/wordml/cex" xmlns:w16cid="http://schemas.microsoft.com/office/word/2016/wordml/cid" xmlns:w16="http://schemas.microsoft.com/office/word/2018/wordml" xmlns:w16du="http://schemas.microsoft.com/office/word/2023/wordml/word16du" xmlns:w16sdtdh="http://schemas.microsoft.com/office/word/2020/wordml/sdtdatahash" xmlns:w16sdtfl="http://schemas.microsoft.com/office/word/2024/wordml/sdtformatlock" xmlns:w16se="http://schemas.microsoft.com/office/word/2015/wordml/symex" xmlns:wpg="http://schemas.microsoft.com/office/word/2010/wordprocessingGroup" xmlns:wpi="http://schemas.microsoft.com/office/word/2010/wordprocessingInk" xmlns:wne="http://schemas.microsoft.com/office/word/2006/wordml" xmlns:wps="http://schemas.microsoft.com/office/word/2010/wordprocessingShape" mc:Ignorable="w14 w15 w16se w16cid w16 w16cex w16sdtdh w16sdtfl w16du wp14">
   <w:body>
     <w:p>
       <w:pPr>
         <w:spacing w:after="0"/>
+        <w:contextualSpacing/>
         <w:jc w:val="center"/>
-        <w:rPr>
-          <w:sz w:val="22"/>
-          <w:szCs w:val="22"/>
-        </w:rPr>
       </w:pPr>
       <w:r>
-        <w:rPr>
-          <w:sz w:val="22"/>
-          <w:szCs w:val="22"/>
-        </w:rPr>
         <w:t>Git</w:t>
       </w:r>
     </w:p>
     <w:p>
       <w:pPr>
         <w:spacing w:after="0"/>
-        <w:rPr>
-          <w:sz w:val="22"/>
-          <w:szCs w:val="22"/>
-        </w:rPr>
+        <w:contextualSpacing/>
       </w:pPr>
       <w:r>
-        <w:rPr>
-          <w:sz w:val="22"/>
-          <w:szCs w:val="22"/>
-        </w:rPr>
         <w:t>Git working flow:</w:t>
       </w:r>
     </w:p>
     <w:p>
       <w:pPr>
         <w:spacing w:after="0"/>
-        <w:rPr>
-          <w:sz w:val="22"/>
-          <w:szCs w:val="22"/>
-        </w:rPr>
+        <w:contextualSpacing/>
       </w:pPr>
       <w:r>
         <w:rPr>
           <w:noProof/>
-          <w:sz w:val="22"/>
-          <w:szCs w:val="22"/>
         </w:rPr>
         <w:drawing>
-          <wp:inline distT="0" distB="0" distL="0" distR="0" wp14:anchorId="2071AAEB" wp14:editId="69E56066">
-            <wp:extent cx="2857500" cy="2631909"/>
+          <wp:inline distT="0" distB="0" distL="0" distR="0" wp14:anchorId="28D7380C" wp14:editId="1C60A77A">
+            <wp:extent cx="3111335" cy="2862428"/>
             <wp:effectExtent l="0" t="0" r="0" b="0"/>
-            <wp:docPr id="742684717" name="Picture 1"/>
+            <wp:docPr id="1918362106" name="Picture 2"/>
             <wp:cNvGraphicFramePr>
               <a:graphicFrameLocks xmlns:a="http://schemas.openxmlformats.org/drawingml/2006/main" noChangeAspect="1"/>
             </wp:cNvGraphicFramePr>
@@ -61,23 +42,36 @@
               <a:graphicData uri="http://schemas.openxmlformats.org/drawingml/2006/picture">
                 <pic:pic xmlns:pic="http://schemas.openxmlformats.org/drawingml/2006/picture">
                   <pic:nvPicPr>
-                    <pic:cNvPr id="742684717" name=""/>
-                    <pic:cNvPicPr/>
+                    <pic:cNvPr id="0" name="Picture 1"/>
+                    <pic:cNvPicPr>
+                      <a:picLocks noChangeAspect="1" noChangeArrowheads="1"/>
+                    </pic:cNvPicPr>
                   </pic:nvPicPr>
                   <pic:blipFill>
-                    <a:blip r:embed="rId4"/>
+                    <a:blip r:embed="rId4">
+                      <a:extLst>
+                        <a:ext uri="{28A0092B-C50C-407E-A947-70E740481C1C}">
+                          <a14:useLocalDpi xmlns:a14="http://schemas.microsoft.com/office/drawing/2010/main" val="0"/>
+                        </a:ext>
+                      </a:extLst>
+                    </a:blip>
+                    <a:srcRect/>
                     <a:stretch>
                       <a:fillRect/>
                     </a:stretch>
                   </pic:blipFill>
-                  <pic:spPr>
+                  <pic:spPr bwMode="auto">
                     <a:xfrm>
                       <a:off x="0" y="0"/>
-                      <a:ext cx="2862970" cy="2636947"/>
+                      <a:ext cx="3114711" cy="2865534"/>
                     </a:xfrm>
                     <a:prstGeom prst="rect">
                       <a:avLst/>
                     </a:prstGeom>
+                    <a:noFill/>
+                    <a:ln>
+                      <a:noFill/>
+                    </a:ln>
                   </pic:spPr>
                 </pic:pic>
               </a:graphicData>
@@ -101,22 +95,27 @@
         <w:tc>
           <w:tcPr>
             <w:tcW w:w="3256" w:type="dxa"/>
-          </w:tcPr>
-          <w:p>
-            <w:pPr>
+            <w:tcBorders>
+              <w:top w:val="single" w:sz="4" w:space="0" w:color="auto"/>
+              <w:left w:val="single" w:sz="4" w:space="0" w:color="auto"/>
+              <w:bottom w:val="single" w:sz="4" w:space="0" w:color="auto"/>
+              <w:right w:val="single" w:sz="4" w:space="0" w:color="auto"/>
+            </w:tcBorders>
+            <w:hideMark/>
+          </w:tcPr>
+          <w:p>
+            <w:pPr>
+              <w:spacing w:line="278" w:lineRule="auto"/>
+              <w:contextualSpacing/>
               <w:rPr>
                 <w:b/>
                 <w:bCs/>
-                <w:sz w:val="22"/>
-                <w:szCs w:val="22"/>
               </w:rPr>
             </w:pPr>
             <w:r>
               <w:rPr>
                 <w:b/>
                 <w:bCs/>
-                <w:sz w:val="22"/>
-                <w:szCs w:val="22"/>
               </w:rPr>
               <w:t>Code</w:t>
             </w:r>
@@ -125,22 +124,27 @@
         <w:tc>
           <w:tcPr>
             <w:tcW w:w="2977" w:type="dxa"/>
-          </w:tcPr>
-          <w:p>
-            <w:pPr>
+            <w:tcBorders>
+              <w:top w:val="single" w:sz="4" w:space="0" w:color="auto"/>
+              <w:left w:val="single" w:sz="4" w:space="0" w:color="auto"/>
+              <w:bottom w:val="single" w:sz="4" w:space="0" w:color="auto"/>
+              <w:right w:val="single" w:sz="4" w:space="0" w:color="auto"/>
+            </w:tcBorders>
+            <w:hideMark/>
+          </w:tcPr>
+          <w:p>
+            <w:pPr>
+              <w:spacing w:line="278" w:lineRule="auto"/>
+              <w:contextualSpacing/>
               <w:rPr>
                 <w:b/>
                 <w:bCs/>
-                <w:sz w:val="22"/>
-                <w:szCs w:val="22"/>
               </w:rPr>
             </w:pPr>
             <w:r>
               <w:rPr>
                 <w:b/>
                 <w:bCs/>
-                <w:sz w:val="22"/>
-                <w:szCs w:val="22"/>
               </w:rPr>
               <w:t>Desc</w:t>
             </w:r>
@@ -149,22 +153,27 @@
         <w:tc>
           <w:tcPr>
             <w:tcW w:w="3117" w:type="dxa"/>
-          </w:tcPr>
-          <w:p>
-            <w:pPr>
+            <w:tcBorders>
+              <w:top w:val="single" w:sz="4" w:space="0" w:color="auto"/>
+              <w:left w:val="single" w:sz="4" w:space="0" w:color="auto"/>
+              <w:bottom w:val="single" w:sz="4" w:space="0" w:color="auto"/>
+              <w:right w:val="single" w:sz="4" w:space="0" w:color="auto"/>
+            </w:tcBorders>
+            <w:hideMark/>
+          </w:tcPr>
+          <w:p>
+            <w:pPr>
+              <w:spacing w:line="278" w:lineRule="auto"/>
+              <w:contextualSpacing/>
               <w:rPr>
                 <w:b/>
                 <w:bCs/>
-                <w:sz w:val="22"/>
-                <w:szCs w:val="22"/>
               </w:rPr>
             </w:pPr>
             <w:r>
               <w:rPr>
                 <w:b/>
                 <w:bCs/>
-                <w:sz w:val="22"/>
-                <w:szCs w:val="22"/>
               </w:rPr>
               <w:t>Remarks</w:t>
             </w:r>
@@ -175,51 +184,38 @@
         <w:tc>
           <w:tcPr>
             <w:tcW w:w="3256" w:type="dxa"/>
-          </w:tcPr>
-          <w:p>
-            <w:pPr>
-              <w:rPr>
-                <w:sz w:val="22"/>
-                <w:szCs w:val="22"/>
-              </w:rPr>
-            </w:pPr>
-            <w:r>
-              <w:rPr>
-                <w:sz w:val="22"/>
-                <w:szCs w:val="22"/>
-              </w:rPr>
+            <w:tcBorders>
+              <w:top w:val="single" w:sz="4" w:space="0" w:color="auto"/>
+              <w:left w:val="single" w:sz="4" w:space="0" w:color="auto"/>
+              <w:bottom w:val="single" w:sz="4" w:space="0" w:color="auto"/>
+              <w:right w:val="single" w:sz="4" w:space="0" w:color="auto"/>
+            </w:tcBorders>
+            <w:hideMark/>
+          </w:tcPr>
+          <w:p>
+            <w:pPr>
+              <w:spacing w:line="278" w:lineRule="auto"/>
+              <w:contextualSpacing/>
+            </w:pPr>
+            <w:r>
               <w:t xml:space="preserve">git config –global </w:t>
             </w:r>
             <w:proofErr w:type="spellStart"/>
-            <w:r>
-              <w:rPr>
-                <w:sz w:val="22"/>
-                <w:szCs w:val="22"/>
-              </w:rPr>
+            <w:proofErr w:type="gramStart"/>
+            <w:r>
               <w:t>user.email</w:t>
             </w:r>
             <w:proofErr w:type="spellEnd"/>
-            <w:r>
-              <w:rPr>
-                <w:sz w:val="22"/>
-                <w:szCs w:val="22"/>
-              </w:rPr>
+            <w:proofErr w:type="gramEnd"/>
+            <w:r>
               <w:t xml:space="preserve"> “</w:t>
             </w:r>
             <w:proofErr w:type="spellStart"/>
             <w:r>
-              <w:rPr>
-                <w:sz w:val="22"/>
-                <w:szCs w:val="22"/>
-              </w:rPr>
               <w:t>wasim</w:t>
             </w:r>
             <w:proofErr w:type="spellEnd"/>
             <w:r>
-              <w:rPr>
-                <w:sz w:val="22"/>
-                <w:szCs w:val="22"/>
-              </w:rPr>
               <w:t xml:space="preserve"> khan”</w:t>
             </w:r>
           </w:p>
@@ -227,19 +223,20 @@
         <w:tc>
           <w:tcPr>
             <w:tcW w:w="2977" w:type="dxa"/>
-          </w:tcPr>
-          <w:p>
-            <w:pPr>
-              <w:rPr>
-                <w:sz w:val="22"/>
-                <w:szCs w:val="22"/>
-              </w:rPr>
-            </w:pPr>
-            <w:r>
-              <w:rPr>
-                <w:sz w:val="22"/>
-                <w:szCs w:val="22"/>
-              </w:rPr>
+            <w:tcBorders>
+              <w:top w:val="single" w:sz="4" w:space="0" w:color="auto"/>
+              <w:left w:val="single" w:sz="4" w:space="0" w:color="auto"/>
+              <w:bottom w:val="single" w:sz="4" w:space="0" w:color="auto"/>
+              <w:right w:val="single" w:sz="4" w:space="0" w:color="auto"/>
+            </w:tcBorders>
+            <w:hideMark/>
+          </w:tcPr>
+          <w:p>
+            <w:pPr>
+              <w:spacing w:line="278" w:lineRule="auto"/>
+              <w:contextualSpacing/>
+            </w:pPr>
+            <w:r>
               <w:t xml:space="preserve">Set the global username </w:t>
             </w:r>
           </w:p>
@@ -247,19 +244,20 @@
         <w:tc>
           <w:tcPr>
             <w:tcW w:w="3117" w:type="dxa"/>
-          </w:tcPr>
-          <w:p>
-            <w:pPr>
-              <w:rPr>
-                <w:sz w:val="22"/>
-                <w:szCs w:val="22"/>
-              </w:rPr>
-            </w:pPr>
-            <w:r>
-              <w:rPr>
-                <w:sz w:val="22"/>
-                <w:szCs w:val="22"/>
-              </w:rPr>
+            <w:tcBorders>
+              <w:top w:val="single" w:sz="4" w:space="0" w:color="auto"/>
+              <w:left w:val="single" w:sz="4" w:space="0" w:color="auto"/>
+              <w:bottom w:val="single" w:sz="4" w:space="0" w:color="auto"/>
+              <w:right w:val="single" w:sz="4" w:space="0" w:color="auto"/>
+            </w:tcBorders>
+            <w:hideMark/>
+          </w:tcPr>
+          <w:p>
+            <w:pPr>
+              <w:spacing w:line="278" w:lineRule="auto"/>
+              <w:contextualSpacing/>
+            </w:pPr>
+            <w:r>
               <w:t>Configure your identity (one-time, global)</w:t>
             </w:r>
           </w:p>
@@ -269,35 +267,30 @@
         <w:tc>
           <w:tcPr>
             <w:tcW w:w="3256" w:type="dxa"/>
-          </w:tcPr>
-          <w:p>
-            <w:pPr>
-              <w:rPr>
-                <w:sz w:val="22"/>
-                <w:szCs w:val="22"/>
-              </w:rPr>
-            </w:pPr>
-            <w:r>
-              <w:rPr>
-                <w:sz w:val="22"/>
-                <w:szCs w:val="22"/>
-              </w:rPr>
+            <w:tcBorders>
+              <w:top w:val="single" w:sz="4" w:space="0" w:color="auto"/>
+              <w:left w:val="single" w:sz="4" w:space="0" w:color="auto"/>
+              <w:bottom w:val="single" w:sz="4" w:space="0" w:color="auto"/>
+              <w:right w:val="single" w:sz="4" w:space="0" w:color="auto"/>
+            </w:tcBorders>
+            <w:hideMark/>
+          </w:tcPr>
+          <w:p>
+            <w:pPr>
+              <w:spacing w:line="278" w:lineRule="auto"/>
+              <w:contextualSpacing/>
+            </w:pPr>
+            <w:r>
               <w:t xml:space="preserve">Git config –global </w:t>
             </w:r>
             <w:proofErr w:type="spellStart"/>
-            <w:r>
-              <w:rPr>
-                <w:sz w:val="22"/>
-                <w:szCs w:val="22"/>
-              </w:rPr>
+            <w:proofErr w:type="gramStart"/>
+            <w:r>
               <w:t>user.email</w:t>
             </w:r>
             <w:proofErr w:type="spellEnd"/>
-            <w:r>
-              <w:rPr>
-                <w:sz w:val="22"/>
-                <w:szCs w:val="22"/>
-              </w:rPr>
+            <w:proofErr w:type="gramEnd"/>
+            <w:r>
               <w:t xml:space="preserve"> “xyz@email.com”</w:t>
             </w:r>
           </w:p>
@@ -305,19 +298,20 @@
         <w:tc>
           <w:tcPr>
             <w:tcW w:w="2977" w:type="dxa"/>
-          </w:tcPr>
-          <w:p>
-            <w:pPr>
-              <w:rPr>
-                <w:sz w:val="22"/>
-                <w:szCs w:val="22"/>
-              </w:rPr>
-            </w:pPr>
-            <w:r>
-              <w:rPr>
-                <w:sz w:val="22"/>
-                <w:szCs w:val="22"/>
-              </w:rPr>
+            <w:tcBorders>
+              <w:top w:val="single" w:sz="4" w:space="0" w:color="auto"/>
+              <w:left w:val="single" w:sz="4" w:space="0" w:color="auto"/>
+              <w:bottom w:val="single" w:sz="4" w:space="0" w:color="auto"/>
+              <w:right w:val="single" w:sz="4" w:space="0" w:color="auto"/>
+            </w:tcBorders>
+            <w:hideMark/>
+          </w:tcPr>
+          <w:p>
+            <w:pPr>
+              <w:spacing w:line="278" w:lineRule="auto"/>
+              <w:contextualSpacing/>
+            </w:pPr>
+            <w:r>
               <w:t>Set the global email</w:t>
             </w:r>
           </w:p>
@@ -325,19 +319,20 @@
         <w:tc>
           <w:tcPr>
             <w:tcW w:w="3117" w:type="dxa"/>
-          </w:tcPr>
-          <w:p>
-            <w:pPr>
-              <w:rPr>
-                <w:sz w:val="22"/>
-                <w:szCs w:val="22"/>
-              </w:rPr>
-            </w:pPr>
-            <w:r>
-              <w:rPr>
-                <w:sz w:val="22"/>
-                <w:szCs w:val="22"/>
-              </w:rPr>
+            <w:tcBorders>
+              <w:top w:val="single" w:sz="4" w:space="0" w:color="auto"/>
+              <w:left w:val="single" w:sz="4" w:space="0" w:color="auto"/>
+              <w:bottom w:val="single" w:sz="4" w:space="0" w:color="auto"/>
+              <w:right w:val="single" w:sz="4" w:space="0" w:color="auto"/>
+            </w:tcBorders>
+            <w:hideMark/>
+          </w:tcPr>
+          <w:p>
+            <w:pPr>
+              <w:spacing w:line="278" w:lineRule="auto"/>
+              <w:contextualSpacing/>
+            </w:pPr>
+            <w:r>
               <w:t>One time setup</w:t>
             </w:r>
           </w:p>
@@ -347,35 +342,30 @@
         <w:tc>
           <w:tcPr>
             <w:tcW w:w="3256" w:type="dxa"/>
-          </w:tcPr>
-          <w:p>
-            <w:pPr>
-              <w:rPr>
-                <w:sz w:val="22"/>
-                <w:szCs w:val="22"/>
-              </w:rPr>
-            </w:pPr>
-            <w:r>
-              <w:rPr>
-                <w:sz w:val="22"/>
-                <w:szCs w:val="22"/>
-              </w:rPr>
+            <w:tcBorders>
+              <w:top w:val="single" w:sz="4" w:space="0" w:color="auto"/>
+              <w:left w:val="single" w:sz="4" w:space="0" w:color="auto"/>
+              <w:bottom w:val="single" w:sz="4" w:space="0" w:color="auto"/>
+              <w:right w:val="single" w:sz="4" w:space="0" w:color="auto"/>
+            </w:tcBorders>
+            <w:hideMark/>
+          </w:tcPr>
+          <w:p>
+            <w:pPr>
+              <w:spacing w:line="278" w:lineRule="auto"/>
+              <w:contextualSpacing/>
+            </w:pPr>
+            <w:r>
               <w:t xml:space="preserve">git config --global </w:t>
             </w:r>
             <w:proofErr w:type="spellStart"/>
-            <w:r>
-              <w:rPr>
-                <w:sz w:val="22"/>
-                <w:szCs w:val="22"/>
-              </w:rPr>
+            <w:proofErr w:type="gramStart"/>
+            <w:r>
               <w:t>core.autocrlf</w:t>
             </w:r>
             <w:proofErr w:type="spellEnd"/>
-            <w:r>
-              <w:rPr>
-                <w:sz w:val="22"/>
-                <w:szCs w:val="22"/>
-              </w:rPr>
+            <w:proofErr w:type="gramEnd"/>
+            <w:r>
               <w:t xml:space="preserve"> true</w:t>
             </w:r>
           </w:p>
@@ -383,19 +373,20 @@
         <w:tc>
           <w:tcPr>
             <w:tcW w:w="2977" w:type="dxa"/>
-          </w:tcPr>
-          <w:p>
-            <w:pPr>
-              <w:rPr>
-                <w:sz w:val="22"/>
-                <w:szCs w:val="22"/>
-              </w:rPr>
-            </w:pPr>
-            <w:r>
-              <w:rPr>
-                <w:sz w:val="22"/>
-                <w:szCs w:val="22"/>
-              </w:rPr>
+            <w:tcBorders>
+              <w:top w:val="single" w:sz="4" w:space="0" w:color="auto"/>
+              <w:left w:val="single" w:sz="4" w:space="0" w:color="auto"/>
+              <w:bottom w:val="single" w:sz="4" w:space="0" w:color="auto"/>
+              <w:right w:val="single" w:sz="4" w:space="0" w:color="auto"/>
+            </w:tcBorders>
+            <w:hideMark/>
+          </w:tcPr>
+          <w:p>
+            <w:pPr>
+              <w:spacing w:line="278" w:lineRule="auto"/>
+              <w:contextualSpacing/>
+            </w:pPr>
+            <w:r>
               <w:t>line-ending differences show up as noisy diffs on every file even when nothing actually changed</w:t>
             </w:r>
           </w:p>
@@ -403,13 +394,17 @@
         <w:tc>
           <w:tcPr>
             <w:tcW w:w="3117" w:type="dxa"/>
-          </w:tcPr>
-          <w:p>
-            <w:pPr>
-              <w:rPr>
-                <w:sz w:val="22"/>
-                <w:szCs w:val="22"/>
-              </w:rPr>
+            <w:tcBorders>
+              <w:top w:val="single" w:sz="4" w:space="0" w:color="auto"/>
+              <w:left w:val="single" w:sz="4" w:space="0" w:color="auto"/>
+              <w:bottom w:val="single" w:sz="4" w:space="0" w:color="auto"/>
+              <w:right w:val="single" w:sz="4" w:space="0" w:color="auto"/>
+            </w:tcBorders>
+          </w:tcPr>
+          <w:p>
+            <w:pPr>
+              <w:spacing w:line="278" w:lineRule="auto"/>
+              <w:contextualSpacing/>
             </w:pPr>
           </w:p>
         </w:tc>
@@ -418,19 +413,20 @@
         <w:tc>
           <w:tcPr>
             <w:tcW w:w="3256" w:type="dxa"/>
-          </w:tcPr>
-          <w:p>
-            <w:pPr>
-              <w:rPr>
-                <w:sz w:val="22"/>
-                <w:szCs w:val="22"/>
-              </w:rPr>
-            </w:pPr>
-            <w:r>
-              <w:rPr>
-                <w:sz w:val="22"/>
-                <w:szCs w:val="22"/>
-              </w:rPr>
+            <w:tcBorders>
+              <w:top w:val="single" w:sz="4" w:space="0" w:color="auto"/>
+              <w:left w:val="single" w:sz="4" w:space="0" w:color="auto"/>
+              <w:bottom w:val="single" w:sz="4" w:space="0" w:color="auto"/>
+              <w:right w:val="single" w:sz="4" w:space="0" w:color="auto"/>
+            </w:tcBorders>
+            <w:hideMark/>
+          </w:tcPr>
+          <w:p>
+            <w:pPr>
+              <w:spacing w:line="278" w:lineRule="auto"/>
+              <w:contextualSpacing/>
+            </w:pPr>
+            <w:r>
               <w:t>Git clone url</w:t>
             </w:r>
           </w:p>
@@ -438,19 +434,20 @@
         <w:tc>
           <w:tcPr>
             <w:tcW w:w="2977" w:type="dxa"/>
-          </w:tcPr>
-          <w:p>
-            <w:pPr>
-              <w:rPr>
-                <w:sz w:val="22"/>
-                <w:szCs w:val="22"/>
-              </w:rPr>
-            </w:pPr>
-            <w:r>
-              <w:rPr>
-                <w:sz w:val="22"/>
-                <w:szCs w:val="22"/>
-              </w:rPr>
+            <w:tcBorders>
+              <w:top w:val="single" w:sz="4" w:space="0" w:color="auto"/>
+              <w:left w:val="single" w:sz="4" w:space="0" w:color="auto"/>
+              <w:bottom w:val="single" w:sz="4" w:space="0" w:color="auto"/>
+              <w:right w:val="single" w:sz="4" w:space="0" w:color="auto"/>
+            </w:tcBorders>
+            <w:hideMark/>
+          </w:tcPr>
+          <w:p>
+            <w:pPr>
+              <w:spacing w:line="278" w:lineRule="auto"/>
+              <w:contextualSpacing/>
+            </w:pPr>
+            <w:r>
               <w:t>Clone the repository</w:t>
             </w:r>
           </w:p>
@@ -458,35 +455,28 @@
         <w:tc>
           <w:tcPr>
             <w:tcW w:w="3117" w:type="dxa"/>
-          </w:tcPr>
-          <w:p>
-            <w:pPr>
-              <w:rPr>
-                <w:sz w:val="22"/>
-                <w:szCs w:val="22"/>
-              </w:rPr>
-            </w:pPr>
-            <w:r>
-              <w:rPr>
-                <w:sz w:val="22"/>
-                <w:szCs w:val="22"/>
-              </w:rPr>
+            <w:tcBorders>
+              <w:top w:val="single" w:sz="4" w:space="0" w:color="auto"/>
+              <w:left w:val="single" w:sz="4" w:space="0" w:color="auto"/>
+              <w:bottom w:val="single" w:sz="4" w:space="0" w:color="auto"/>
+              <w:right w:val="single" w:sz="4" w:space="0" w:color="auto"/>
+            </w:tcBorders>
+            <w:hideMark/>
+          </w:tcPr>
+          <w:p>
+            <w:pPr>
+              <w:spacing w:line="278" w:lineRule="auto"/>
+              <w:contextualSpacing/>
+            </w:pPr>
+            <w:r>
               <w:t xml:space="preserve">From </w:t>
             </w:r>
             <w:proofErr w:type="spellStart"/>
             <w:r>
-              <w:rPr>
-                <w:sz w:val="22"/>
-                <w:szCs w:val="22"/>
-              </w:rPr>
               <w:t>github</w:t>
             </w:r>
             <w:proofErr w:type="spellEnd"/>
             <w:r>
-              <w:rPr>
-                <w:sz w:val="22"/>
-                <w:szCs w:val="22"/>
-              </w:rPr>
               <w:t xml:space="preserve"> repo</w:t>
             </w:r>
           </w:p>
@@ -496,39 +486,46 @@
         <w:tc>
           <w:tcPr>
             <w:tcW w:w="3256" w:type="dxa"/>
-          </w:tcPr>
-          <w:p>
-            <w:pPr>
-              <w:rPr>
-                <w:sz w:val="22"/>
-                <w:szCs w:val="22"/>
-              </w:rPr>
-            </w:pPr>
-            <w:r>
-              <w:rPr>
-                <w:sz w:val="22"/>
-                <w:szCs w:val="22"/>
-              </w:rPr>
-              <w:t>Git add .</w:t>
-            </w:r>
+            <w:tcBorders>
+              <w:top w:val="single" w:sz="4" w:space="0" w:color="auto"/>
+              <w:left w:val="single" w:sz="4" w:space="0" w:color="auto"/>
+              <w:bottom w:val="single" w:sz="4" w:space="0" w:color="auto"/>
+              <w:right w:val="single" w:sz="4" w:space="0" w:color="auto"/>
+            </w:tcBorders>
+            <w:hideMark/>
+          </w:tcPr>
+          <w:p>
+            <w:pPr>
+              <w:spacing w:line="278" w:lineRule="auto"/>
+              <w:contextualSpacing/>
+            </w:pPr>
+            <w:r>
+              <w:t xml:space="preserve">Git </w:t>
+            </w:r>
+            <w:proofErr w:type="gramStart"/>
+            <w:r>
+              <w:t>add .</w:t>
+            </w:r>
+            <w:proofErr w:type="gramEnd"/>
           </w:p>
         </w:tc>
         <w:tc>
           <w:tcPr>
             <w:tcW w:w="2977" w:type="dxa"/>
-          </w:tcPr>
-          <w:p>
-            <w:pPr>
-              <w:rPr>
-                <w:sz w:val="22"/>
-                <w:szCs w:val="22"/>
-              </w:rPr>
-            </w:pPr>
-            <w:r>
-              <w:rPr>
-                <w:sz w:val="22"/>
-                <w:szCs w:val="22"/>
-              </w:rPr>
+            <w:tcBorders>
+              <w:top w:val="single" w:sz="4" w:space="0" w:color="auto"/>
+              <w:left w:val="single" w:sz="4" w:space="0" w:color="auto"/>
+              <w:bottom w:val="single" w:sz="4" w:space="0" w:color="auto"/>
+              <w:right w:val="single" w:sz="4" w:space="0" w:color="auto"/>
+            </w:tcBorders>
+            <w:hideMark/>
+          </w:tcPr>
+          <w:p>
+            <w:pPr>
+              <w:spacing w:line="278" w:lineRule="auto"/>
+              <w:contextualSpacing/>
+            </w:pPr>
+            <w:r>
               <w:t>Add all the files to staging area</w:t>
             </w:r>
           </w:p>
@@ -536,13 +533,17 @@
         <w:tc>
           <w:tcPr>
             <w:tcW w:w="3117" w:type="dxa"/>
-          </w:tcPr>
-          <w:p>
-            <w:pPr>
-              <w:rPr>
-                <w:sz w:val="22"/>
-                <w:szCs w:val="22"/>
-              </w:rPr>
+            <w:tcBorders>
+              <w:top w:val="single" w:sz="4" w:space="0" w:color="auto"/>
+              <w:left w:val="single" w:sz="4" w:space="0" w:color="auto"/>
+              <w:bottom w:val="single" w:sz="4" w:space="0" w:color="auto"/>
+              <w:right w:val="single" w:sz="4" w:space="0" w:color="auto"/>
+            </w:tcBorders>
+          </w:tcPr>
+          <w:p>
+            <w:pPr>
+              <w:spacing w:line="278" w:lineRule="auto"/>
+              <w:contextualSpacing/>
             </w:pPr>
           </w:p>
         </w:tc>
@@ -551,19 +552,20 @@
         <w:tc>
           <w:tcPr>
             <w:tcW w:w="3256" w:type="dxa"/>
-          </w:tcPr>
-          <w:p>
-            <w:pPr>
-              <w:rPr>
-                <w:sz w:val="22"/>
-                <w:szCs w:val="22"/>
-              </w:rPr>
-            </w:pPr>
-            <w:r>
-              <w:rPr>
-                <w:sz w:val="22"/>
-                <w:szCs w:val="22"/>
-              </w:rPr>
+            <w:tcBorders>
+              <w:top w:val="single" w:sz="4" w:space="0" w:color="auto"/>
+              <w:left w:val="single" w:sz="4" w:space="0" w:color="auto"/>
+              <w:bottom w:val="single" w:sz="4" w:space="0" w:color="auto"/>
+              <w:right w:val="single" w:sz="4" w:space="0" w:color="auto"/>
+            </w:tcBorders>
+            <w:hideMark/>
+          </w:tcPr>
+          <w:p>
+            <w:pPr>
+              <w:spacing w:line="278" w:lineRule="auto"/>
+              <w:contextualSpacing/>
+            </w:pPr>
+            <w:r>
               <w:t>Git add &lt;filename&gt;</w:t>
             </w:r>
           </w:p>
@@ -571,19 +573,20 @@
         <w:tc>
           <w:tcPr>
             <w:tcW w:w="2977" w:type="dxa"/>
-          </w:tcPr>
-          <w:p>
-            <w:pPr>
-              <w:rPr>
-                <w:sz w:val="22"/>
-                <w:szCs w:val="22"/>
-              </w:rPr>
-            </w:pPr>
-            <w:r>
-              <w:rPr>
-                <w:sz w:val="22"/>
-                <w:szCs w:val="22"/>
-              </w:rPr>
+            <w:tcBorders>
+              <w:top w:val="single" w:sz="4" w:space="0" w:color="auto"/>
+              <w:left w:val="single" w:sz="4" w:space="0" w:color="auto"/>
+              <w:bottom w:val="single" w:sz="4" w:space="0" w:color="auto"/>
+              <w:right w:val="single" w:sz="4" w:space="0" w:color="auto"/>
+            </w:tcBorders>
+            <w:hideMark/>
+          </w:tcPr>
+          <w:p>
+            <w:pPr>
+              <w:spacing w:line="278" w:lineRule="auto"/>
+              <w:contextualSpacing/>
+            </w:pPr>
+            <w:r>
               <w:t>Add only specific file to staging area by providing the file name</w:t>
             </w:r>
           </w:p>
@@ -591,21 +594,23 @@
         <w:tc>
           <w:tcPr>
             <w:tcW w:w="3117" w:type="dxa"/>
-          </w:tcPr>
-          <w:p>
-            <w:pPr>
-              <w:rPr>
-                <w:sz w:val="22"/>
-                <w:szCs w:val="22"/>
-              </w:rPr>
-            </w:pPr>
-          </w:p>
-          <w:p>
-            <w:pPr>
-              <w:rPr>
-                <w:sz w:val="22"/>
-                <w:szCs w:val="22"/>
-              </w:rPr>
+            <w:tcBorders>
+              <w:top w:val="single" w:sz="4" w:space="0" w:color="auto"/>
+              <w:left w:val="single" w:sz="4" w:space="0" w:color="auto"/>
+              <w:bottom w:val="single" w:sz="4" w:space="0" w:color="auto"/>
+              <w:right w:val="single" w:sz="4" w:space="0" w:color="auto"/>
+            </w:tcBorders>
+          </w:tcPr>
+          <w:p>
+            <w:pPr>
+              <w:spacing w:line="278" w:lineRule="auto"/>
+              <w:contextualSpacing/>
+            </w:pPr>
+          </w:p>
+          <w:p>
+            <w:pPr>
+              <w:spacing w:line="278" w:lineRule="auto"/>
+              <w:contextualSpacing/>
             </w:pPr>
           </w:p>
         </w:tc>
@@ -614,19 +619,20 @@
         <w:tc>
           <w:tcPr>
             <w:tcW w:w="3256" w:type="dxa"/>
-          </w:tcPr>
-          <w:p>
-            <w:pPr>
-              <w:rPr>
-                <w:sz w:val="22"/>
-                <w:szCs w:val="22"/>
-              </w:rPr>
-            </w:pPr>
-            <w:r>
-              <w:rPr>
-                <w:sz w:val="22"/>
-                <w:szCs w:val="22"/>
-              </w:rPr>
+            <w:tcBorders>
+              <w:top w:val="single" w:sz="4" w:space="0" w:color="auto"/>
+              <w:left w:val="single" w:sz="4" w:space="0" w:color="auto"/>
+              <w:bottom w:val="single" w:sz="4" w:space="0" w:color="auto"/>
+              <w:right w:val="single" w:sz="4" w:space="0" w:color="auto"/>
+            </w:tcBorders>
+            <w:hideMark/>
+          </w:tcPr>
+          <w:p>
+            <w:pPr>
+              <w:spacing w:line="278" w:lineRule="auto"/>
+              <w:contextualSpacing/>
+            </w:pPr>
+            <w:r>
               <w:t>Git commit -m “&lt;commit msg&gt;”</w:t>
             </w:r>
           </w:p>
@@ -634,19 +640,20 @@
         <w:tc>
           <w:tcPr>
             <w:tcW w:w="2977" w:type="dxa"/>
-          </w:tcPr>
-          <w:p>
-            <w:pPr>
-              <w:rPr>
-                <w:sz w:val="22"/>
-                <w:szCs w:val="22"/>
-              </w:rPr>
-            </w:pPr>
-            <w:r>
-              <w:rPr>
-                <w:sz w:val="22"/>
-                <w:szCs w:val="22"/>
-              </w:rPr>
+            <w:tcBorders>
+              <w:top w:val="single" w:sz="4" w:space="0" w:color="auto"/>
+              <w:left w:val="single" w:sz="4" w:space="0" w:color="auto"/>
+              <w:bottom w:val="single" w:sz="4" w:space="0" w:color="auto"/>
+              <w:right w:val="single" w:sz="4" w:space="0" w:color="auto"/>
+            </w:tcBorders>
+            <w:hideMark/>
+          </w:tcPr>
+          <w:p>
+            <w:pPr>
+              <w:spacing w:line="278" w:lineRule="auto"/>
+              <w:contextualSpacing/>
+            </w:pPr>
+            <w:r>
               <w:t>Provide commit to local repo like it will create a history to git</w:t>
             </w:r>
           </w:p>
@@ -654,19 +661,20 @@
         <w:tc>
           <w:tcPr>
             <w:tcW w:w="3117" w:type="dxa"/>
-          </w:tcPr>
-          <w:p>
-            <w:pPr>
-              <w:rPr>
-                <w:sz w:val="22"/>
-                <w:szCs w:val="22"/>
-              </w:rPr>
-            </w:pPr>
-            <w:r>
-              <w:rPr>
-                <w:sz w:val="22"/>
-                <w:szCs w:val="22"/>
-              </w:rPr>
+            <w:tcBorders>
+              <w:top w:val="single" w:sz="4" w:space="0" w:color="auto"/>
+              <w:left w:val="single" w:sz="4" w:space="0" w:color="auto"/>
+              <w:bottom w:val="single" w:sz="4" w:space="0" w:color="auto"/>
+              <w:right w:val="single" w:sz="4" w:space="0" w:color="auto"/>
+            </w:tcBorders>
+            <w:hideMark/>
+          </w:tcPr>
+          <w:p>
+            <w:pPr>
+              <w:spacing w:line="278" w:lineRule="auto"/>
+              <w:contextualSpacing/>
+            </w:pPr>
+            <w:r>
               <w:t>It will not push to remote repo until push</w:t>
             </w:r>
           </w:p>
@@ -676,19 +684,20 @@
         <w:tc>
           <w:tcPr>
             <w:tcW w:w="3256" w:type="dxa"/>
-          </w:tcPr>
-          <w:p>
-            <w:pPr>
-              <w:rPr>
-                <w:sz w:val="22"/>
-                <w:szCs w:val="22"/>
-              </w:rPr>
-            </w:pPr>
-            <w:r>
-              <w:rPr>
-                <w:sz w:val="22"/>
-                <w:szCs w:val="22"/>
-              </w:rPr>
+            <w:tcBorders>
+              <w:top w:val="single" w:sz="4" w:space="0" w:color="auto"/>
+              <w:left w:val="single" w:sz="4" w:space="0" w:color="auto"/>
+              <w:bottom w:val="single" w:sz="4" w:space="0" w:color="auto"/>
+              <w:right w:val="single" w:sz="4" w:space="0" w:color="auto"/>
+            </w:tcBorders>
+            <w:hideMark/>
+          </w:tcPr>
+          <w:p>
+            <w:pPr>
+              <w:spacing w:line="278" w:lineRule="auto"/>
+              <w:contextualSpacing/>
+            </w:pPr>
+            <w:r>
               <w:t>Git push</w:t>
             </w:r>
           </w:p>
@@ -696,19 +705,20 @@
         <w:tc>
           <w:tcPr>
             <w:tcW w:w="2977" w:type="dxa"/>
-          </w:tcPr>
-          <w:p>
-            <w:pPr>
-              <w:rPr>
-                <w:sz w:val="22"/>
-                <w:szCs w:val="22"/>
-              </w:rPr>
-            </w:pPr>
-            <w:r>
-              <w:rPr>
-                <w:sz w:val="22"/>
-                <w:szCs w:val="22"/>
-              </w:rPr>
+            <w:tcBorders>
+              <w:top w:val="single" w:sz="4" w:space="0" w:color="auto"/>
+              <w:left w:val="single" w:sz="4" w:space="0" w:color="auto"/>
+              <w:bottom w:val="single" w:sz="4" w:space="0" w:color="auto"/>
+              <w:right w:val="single" w:sz="4" w:space="0" w:color="auto"/>
+            </w:tcBorders>
+            <w:hideMark/>
+          </w:tcPr>
+          <w:p>
+            <w:pPr>
+              <w:spacing w:line="278" w:lineRule="auto"/>
+              <w:contextualSpacing/>
+            </w:pPr>
+            <w:r>
               <w:t>Merge the local changes to remote repo</w:t>
             </w:r>
           </w:p>
@@ -716,19 +726,20 @@
         <w:tc>
           <w:tcPr>
             <w:tcW w:w="3117" w:type="dxa"/>
-          </w:tcPr>
-          <w:p>
-            <w:pPr>
-              <w:rPr>
-                <w:sz w:val="22"/>
-                <w:szCs w:val="22"/>
-              </w:rPr>
-            </w:pPr>
-            <w:r>
-              <w:rPr>
-                <w:sz w:val="22"/>
-                <w:szCs w:val="22"/>
-              </w:rPr>
+            <w:tcBorders>
+              <w:top w:val="single" w:sz="4" w:space="0" w:color="auto"/>
+              <w:left w:val="single" w:sz="4" w:space="0" w:color="auto"/>
+              <w:bottom w:val="single" w:sz="4" w:space="0" w:color="auto"/>
+              <w:right w:val="single" w:sz="4" w:space="0" w:color="auto"/>
+            </w:tcBorders>
+            <w:hideMark/>
+          </w:tcPr>
+          <w:p>
+            <w:pPr>
+              <w:spacing w:line="278" w:lineRule="auto"/>
+              <w:contextualSpacing/>
+            </w:pPr>
+            <w:r>
               <w:t>Add the changes to remote so that others can see the changes</w:t>
             </w:r>
           </w:p>
@@ -738,19 +749,21 @@
         <w:tc>
           <w:tcPr>
             <w:tcW w:w="3256" w:type="dxa"/>
-          </w:tcPr>
-          <w:p>
-            <w:pPr>
-              <w:rPr>
-                <w:sz w:val="22"/>
-                <w:szCs w:val="22"/>
-              </w:rPr>
-            </w:pPr>
-            <w:r>
-              <w:rPr>
-                <w:sz w:val="22"/>
-                <w:szCs w:val="22"/>
-              </w:rPr>
+            <w:tcBorders>
+              <w:top w:val="single" w:sz="4" w:space="0" w:color="auto"/>
+              <w:left w:val="single" w:sz="4" w:space="0" w:color="auto"/>
+              <w:bottom w:val="single" w:sz="4" w:space="0" w:color="auto"/>
+              <w:right w:val="single" w:sz="4" w:space="0" w:color="auto"/>
+            </w:tcBorders>
+            <w:hideMark/>
+          </w:tcPr>
+          <w:p>
+            <w:pPr>
+              <w:spacing w:line="278" w:lineRule="auto"/>
+              <w:contextualSpacing/>
+            </w:pPr>
+            <w:r>
+              <w:lastRenderedPageBreak/>
               <w:t>Git push -u origin &lt;branch name&gt;</w:t>
             </w:r>
           </w:p>
@@ -758,19 +771,20 @@
         <w:tc>
           <w:tcPr>
             <w:tcW w:w="2977" w:type="dxa"/>
-          </w:tcPr>
-          <w:p>
-            <w:pPr>
-              <w:rPr>
-                <w:sz w:val="22"/>
-                <w:szCs w:val="22"/>
-              </w:rPr>
-            </w:pPr>
-            <w:r>
-              <w:rPr>
-                <w:sz w:val="22"/>
-                <w:szCs w:val="22"/>
-              </w:rPr>
+            <w:tcBorders>
+              <w:top w:val="single" w:sz="4" w:space="0" w:color="auto"/>
+              <w:left w:val="single" w:sz="4" w:space="0" w:color="auto"/>
+              <w:bottom w:val="single" w:sz="4" w:space="0" w:color="auto"/>
+              <w:right w:val="single" w:sz="4" w:space="0" w:color="auto"/>
+            </w:tcBorders>
+            <w:hideMark/>
+          </w:tcPr>
+          <w:p>
+            <w:pPr>
+              <w:spacing w:line="278" w:lineRule="auto"/>
+              <w:contextualSpacing/>
+            </w:pPr>
+            <w:r>
               <w:t>Push the changes to specific branch by providing the branch name</w:t>
             </w:r>
           </w:p>
@@ -778,19 +792,20 @@
         <w:tc>
           <w:tcPr>
             <w:tcW w:w="3117" w:type="dxa"/>
-          </w:tcPr>
-          <w:p>
-            <w:pPr>
-              <w:rPr>
-                <w:sz w:val="22"/>
-                <w:szCs w:val="22"/>
-              </w:rPr>
-            </w:pPr>
-            <w:r>
-              <w:rPr>
-                <w:sz w:val="22"/>
-                <w:szCs w:val="22"/>
-              </w:rPr>
+            <w:tcBorders>
+              <w:top w:val="single" w:sz="4" w:space="0" w:color="auto"/>
+              <w:left w:val="single" w:sz="4" w:space="0" w:color="auto"/>
+              <w:bottom w:val="single" w:sz="4" w:space="0" w:color="auto"/>
+              <w:right w:val="single" w:sz="4" w:space="0" w:color="auto"/>
+            </w:tcBorders>
+            <w:hideMark/>
+          </w:tcPr>
+          <w:p>
+            <w:pPr>
+              <w:spacing w:line="278" w:lineRule="auto"/>
+              <w:contextualSpacing/>
+            </w:pPr>
+            <w:r>
               <w:t>Another way to push the changes in branch</w:t>
             </w:r>
           </w:p>
@@ -800,19 +815,19 @@
         <w:tc>
           <w:tcPr>
             <w:tcW w:w="3256" w:type="dxa"/>
-          </w:tcPr>
-          <w:p>
-            <w:pPr>
-              <w:rPr>
-                <w:sz w:val="22"/>
-                <w:szCs w:val="22"/>
-              </w:rPr>
-            </w:pPr>
-            <w:r>
-              <w:rPr>
-                <w:sz w:val="22"/>
-                <w:szCs w:val="22"/>
-              </w:rPr>
+            <w:tcBorders>
+              <w:top w:val="single" w:sz="4" w:space="0" w:color="auto"/>
+              <w:left w:val="single" w:sz="4" w:space="0" w:color="auto"/>
+              <w:bottom w:val="single" w:sz="4" w:space="0" w:color="auto"/>
+              <w:right w:val="single" w:sz="4" w:space="0" w:color="auto"/>
+            </w:tcBorders>
+          </w:tcPr>
+          <w:p>
+            <w:pPr>
+              <w:spacing w:line="278" w:lineRule="auto"/>
+              <w:contextualSpacing/>
+            </w:pPr>
+            <w:r>
               <w:t>Git branch</w:t>
             </w:r>
           </w:p>
@@ -820,33 +835,211 @@
         <w:tc>
           <w:tcPr>
             <w:tcW w:w="2977" w:type="dxa"/>
-          </w:tcPr>
-          <w:p>
-            <w:pPr>
-              <w:rPr>
-                <w:sz w:val="22"/>
-                <w:szCs w:val="22"/>
-              </w:rPr>
-            </w:pPr>
-            <w:r>
-              <w:rPr>
-                <w:sz w:val="22"/>
-                <w:szCs w:val="22"/>
-              </w:rPr>
-              <w:t>Show all the branches</w:t>
+            <w:tcBorders>
+              <w:top w:val="single" w:sz="4" w:space="0" w:color="auto"/>
+              <w:left w:val="single" w:sz="4" w:space="0" w:color="auto"/>
+              <w:bottom w:val="single" w:sz="4" w:space="0" w:color="auto"/>
+              <w:right w:val="single" w:sz="4" w:space="0" w:color="auto"/>
+            </w:tcBorders>
+          </w:tcPr>
+          <w:p>
+            <w:pPr>
+              <w:spacing w:line="278" w:lineRule="auto"/>
+              <w:contextualSpacing/>
+            </w:pPr>
+            <w:r>
+              <w:t>List all the branch available in local</w:t>
             </w:r>
           </w:p>
         </w:tc>
         <w:tc>
           <w:tcPr>
             <w:tcW w:w="3117" w:type="dxa"/>
-          </w:tcPr>
-          <w:p>
-            <w:pPr>
-              <w:rPr>
-                <w:sz w:val="22"/>
-                <w:szCs w:val="22"/>
-              </w:rPr>
+            <w:tcBorders>
+              <w:top w:val="single" w:sz="4" w:space="0" w:color="auto"/>
+              <w:left w:val="single" w:sz="4" w:space="0" w:color="auto"/>
+              <w:bottom w:val="single" w:sz="4" w:space="0" w:color="auto"/>
+              <w:right w:val="single" w:sz="4" w:space="0" w:color="auto"/>
+            </w:tcBorders>
+          </w:tcPr>
+          <w:p>
+            <w:pPr>
+              <w:spacing w:line="278" w:lineRule="auto"/>
+              <w:contextualSpacing/>
+            </w:pPr>
+          </w:p>
+        </w:tc>
+      </w:tr>
+      <w:tr>
+        <w:tc>
+          <w:tcPr>
+            <w:tcW w:w="3256" w:type="dxa"/>
+            <w:tcBorders>
+              <w:top w:val="single" w:sz="4" w:space="0" w:color="auto"/>
+              <w:left w:val="single" w:sz="4" w:space="0" w:color="auto"/>
+              <w:bottom w:val="single" w:sz="4" w:space="0" w:color="auto"/>
+              <w:right w:val="single" w:sz="4" w:space="0" w:color="auto"/>
+            </w:tcBorders>
+          </w:tcPr>
+          <w:p>
+            <w:pPr>
+              <w:contextualSpacing/>
+            </w:pPr>
+            <w:r>
+              <w:t xml:space="preserve">git </w:t>
+            </w:r>
+            <w:r>
+              <w:t>branch -a</w:t>
+            </w:r>
+          </w:p>
+        </w:tc>
+        <w:tc>
+          <w:tcPr>
+            <w:tcW w:w="2977" w:type="dxa"/>
+            <w:tcBorders>
+              <w:top w:val="single" w:sz="4" w:space="0" w:color="auto"/>
+              <w:left w:val="single" w:sz="4" w:space="0" w:color="auto"/>
+              <w:bottom w:val="single" w:sz="4" w:space="0" w:color="auto"/>
+              <w:right w:val="single" w:sz="4" w:space="0" w:color="auto"/>
+            </w:tcBorders>
+          </w:tcPr>
+          <w:p>
+            <w:pPr>
+              <w:contextualSpacing/>
+            </w:pPr>
+            <w:r>
+              <w:t>List all the branch (local + remote)</w:t>
+            </w:r>
+          </w:p>
+        </w:tc>
+        <w:tc>
+          <w:tcPr>
+            <w:tcW w:w="3117" w:type="dxa"/>
+            <w:tcBorders>
+              <w:top w:val="single" w:sz="4" w:space="0" w:color="auto"/>
+              <w:left w:val="single" w:sz="4" w:space="0" w:color="auto"/>
+              <w:bottom w:val="single" w:sz="4" w:space="0" w:color="auto"/>
+              <w:right w:val="single" w:sz="4" w:space="0" w:color="auto"/>
+            </w:tcBorders>
+          </w:tcPr>
+          <w:p>
+            <w:pPr>
+              <w:contextualSpacing/>
+            </w:pPr>
+          </w:p>
+        </w:tc>
+      </w:tr>
+      <w:tr>
+        <w:tc>
+          <w:tcPr>
+            <w:tcW w:w="3256" w:type="dxa"/>
+            <w:tcBorders>
+              <w:top w:val="single" w:sz="4" w:space="0" w:color="auto"/>
+              <w:left w:val="single" w:sz="4" w:space="0" w:color="auto"/>
+              <w:bottom w:val="single" w:sz="4" w:space="0" w:color="auto"/>
+              <w:right w:val="single" w:sz="4" w:space="0" w:color="auto"/>
+            </w:tcBorders>
+          </w:tcPr>
+          <w:p>
+            <w:pPr>
+              <w:contextualSpacing/>
+            </w:pPr>
+            <w:r>
+              <w:t xml:space="preserve">Git </w:t>
+            </w:r>
+            <w:r>
+              <w:t>branch -r</w:t>
+            </w:r>
+          </w:p>
+        </w:tc>
+        <w:tc>
+          <w:tcPr>
+            <w:tcW w:w="2977" w:type="dxa"/>
+            <w:tcBorders>
+              <w:top w:val="single" w:sz="4" w:space="0" w:color="auto"/>
+              <w:left w:val="single" w:sz="4" w:space="0" w:color="auto"/>
+              <w:bottom w:val="single" w:sz="4" w:space="0" w:color="auto"/>
+              <w:right w:val="single" w:sz="4" w:space="0" w:color="auto"/>
+            </w:tcBorders>
+          </w:tcPr>
+          <w:p>
+            <w:pPr>
+              <w:contextualSpacing/>
+            </w:pPr>
+            <w:r>
+              <w:t>List branch only remote</w:t>
+            </w:r>
+          </w:p>
+        </w:tc>
+        <w:tc>
+          <w:tcPr>
+            <w:tcW w:w="3117" w:type="dxa"/>
+            <w:tcBorders>
+              <w:top w:val="single" w:sz="4" w:space="0" w:color="auto"/>
+              <w:left w:val="single" w:sz="4" w:space="0" w:color="auto"/>
+              <w:bottom w:val="single" w:sz="4" w:space="0" w:color="auto"/>
+              <w:right w:val="single" w:sz="4" w:space="0" w:color="auto"/>
+            </w:tcBorders>
+          </w:tcPr>
+          <w:p>
+            <w:pPr>
+              <w:contextualSpacing/>
+            </w:pPr>
+          </w:p>
+        </w:tc>
+      </w:tr>
+      <w:tr>
+        <w:tc>
+          <w:tcPr>
+            <w:tcW w:w="3256" w:type="dxa"/>
+            <w:tcBorders>
+              <w:top w:val="single" w:sz="4" w:space="0" w:color="auto"/>
+              <w:left w:val="single" w:sz="4" w:space="0" w:color="auto"/>
+              <w:bottom w:val="single" w:sz="4" w:space="0" w:color="auto"/>
+              <w:right w:val="single" w:sz="4" w:space="0" w:color="auto"/>
+            </w:tcBorders>
+          </w:tcPr>
+          <w:p>
+            <w:pPr>
+              <w:contextualSpacing/>
+            </w:pPr>
+            <w:r>
+              <w:t>Git branch -v</w:t>
+            </w:r>
+          </w:p>
+        </w:tc>
+        <w:tc>
+          <w:tcPr>
+            <w:tcW w:w="2977" w:type="dxa"/>
+            <w:tcBorders>
+              <w:top w:val="single" w:sz="4" w:space="0" w:color="auto"/>
+              <w:left w:val="single" w:sz="4" w:space="0" w:color="auto"/>
+              <w:bottom w:val="single" w:sz="4" w:space="0" w:color="auto"/>
+              <w:right w:val="single" w:sz="4" w:space="0" w:color="auto"/>
+            </w:tcBorders>
+          </w:tcPr>
+          <w:p>
+            <w:pPr>
+              <w:contextualSpacing/>
+            </w:pPr>
+            <w:r>
+              <w:t>See last commit on each branch</w:t>
+            </w:r>
+          </w:p>
+        </w:tc>
+        <w:tc>
+          <w:tcPr>
+            <w:tcW w:w="3117" w:type="dxa"/>
+            <w:tcBorders>
+              <w:top w:val="single" w:sz="4" w:space="0" w:color="auto"/>
+              <w:left w:val="single" w:sz="4" w:space="0" w:color="auto"/>
+              <w:bottom w:val="single" w:sz="4" w:space="0" w:color="auto"/>
+              <w:right w:val="single" w:sz="4" w:space="0" w:color="auto"/>
+            </w:tcBorders>
+          </w:tcPr>
+          <w:p>
+            <w:pPr>
+              <w:contextualSpacing/>
             </w:pPr>
           </w:p>
         </w:tc>
@@ -855,10 +1048,13 @@
     <w:p>
       <w:pPr>
         <w:spacing w:after="0"/>
-        <w:rPr>
-          <w:sz w:val="22"/>
-          <w:szCs w:val="22"/>
-        </w:rPr>
+        <w:contextualSpacing/>
+      </w:pPr>
+    </w:p>
+    <w:p>
+      <w:pPr>
+        <w:spacing w:after="0"/>
+        <w:contextualSpacing/>
       </w:pPr>
     </w:p>
     <w:sectPr>

</xml_diff>

<commit_message>
new branch related commands added
</commit_message>
<xml_diff>
--- a/Git command.docx
+++ b/Git command.docx
@@ -7,8 +7,16 @@
         <w:spacing w:after="0"/>
         <w:contextualSpacing/>
         <w:jc w:val="center"/>
+        <w:rPr>
+          <w:sz w:val="22"/>
+          <w:szCs w:val="22"/>
+        </w:rPr>
       </w:pPr>
       <w:r>
+        <w:rPr>
+          <w:sz w:val="22"/>
+          <w:szCs w:val="22"/>
+        </w:rPr>
         <w:t>Git</w:t>
       </w:r>
     </w:p>
@@ -16,8 +24,16 @@
       <w:pPr>
         <w:spacing w:after="0"/>
         <w:contextualSpacing/>
+        <w:rPr>
+          <w:sz w:val="22"/>
+          <w:szCs w:val="22"/>
+        </w:rPr>
       </w:pPr>
       <w:r>
+        <w:rPr>
+          <w:sz w:val="22"/>
+          <w:szCs w:val="22"/>
+        </w:rPr>
         <w:t>Git working flow:</w:t>
       </w:r>
     </w:p>
@@ -25,10 +41,16 @@
       <w:pPr>
         <w:spacing w:after="0"/>
         <w:contextualSpacing/>
+        <w:rPr>
+          <w:sz w:val="22"/>
+          <w:szCs w:val="22"/>
+        </w:rPr>
       </w:pPr>
       <w:r>
         <w:rPr>
           <w:noProof/>
+          <w:sz w:val="22"/>
+          <w:szCs w:val="22"/>
         </w:rPr>
         <w:drawing>
           <wp:inline distT="0" distB="0" distL="0" distR="0" wp14:anchorId="28D7380C" wp14:editId="1C60A77A">
@@ -80,6 +102,64 @@
         </w:drawing>
       </w:r>
     </w:p>
+    <w:p>
+      <w:pPr>
+        <w:spacing w:after="0"/>
+        <w:contextualSpacing/>
+        <w:rPr>
+          <w:sz w:val="22"/>
+          <w:szCs w:val="22"/>
+        </w:rPr>
+      </w:pPr>
+      <w:r>
+        <w:rPr>
+          <w:sz w:val="22"/>
+          <w:szCs w:val="22"/>
+        </w:rPr>
+        <w:drawing>
+          <wp:inline distT="0" distB="0" distL="0" distR="0" wp14:anchorId="7B57E378" wp14:editId="7ADCEC5F">
+            <wp:extent cx="2873829" cy="4810546"/>
+            <wp:effectExtent l="0" t="0" r="3175" b="0"/>
+            <wp:docPr id="1612422931" name="Picture 1"/>
+            <wp:cNvGraphicFramePr>
+              <a:graphicFrameLocks xmlns:a="http://schemas.openxmlformats.org/drawingml/2006/main" noChangeAspect="1"/>
+            </wp:cNvGraphicFramePr>
+            <a:graphic xmlns:a="http://schemas.openxmlformats.org/drawingml/2006/main">
+              <a:graphicData uri="http://schemas.openxmlformats.org/drawingml/2006/picture">
+                <pic:pic xmlns:pic="http://schemas.openxmlformats.org/drawingml/2006/picture">
+                  <pic:nvPicPr>
+                    <pic:cNvPr id="1612422931" name=""/>
+                    <pic:cNvPicPr/>
+                  </pic:nvPicPr>
+                  <pic:blipFill>
+                    <a:blip r:embed="rId5"/>
+                    <a:stretch>
+                      <a:fillRect/>
+                    </a:stretch>
+                  </pic:blipFill>
+                  <pic:spPr>
+                    <a:xfrm>
+                      <a:off x="0" y="0"/>
+                      <a:ext cx="2883919" cy="4827435"/>
+                    </a:xfrm>
+                    <a:prstGeom prst="rect">
+                      <a:avLst/>
+                    </a:prstGeom>
+                  </pic:spPr>
+                </pic:pic>
+              </a:graphicData>
+            </a:graphic>
+          </wp:inline>
+        </w:drawing>
+      </w:r>
+      <w:r>
+        <w:rPr>
+          <w:sz w:val="22"/>
+          <w:szCs w:val="22"/>
+        </w:rPr>
+        <w:t xml:space="preserve"> working with branches and merging with main</w:t>
+      </w:r>
+    </w:p>
     <w:tbl>
       <w:tblPr>
         <w:tblStyle w:val="TableGrid"/>
@@ -110,13 +190,18 @@
               <w:rPr>
                 <w:b/>
                 <w:bCs/>
+                <w:sz w:val="22"/>
+                <w:szCs w:val="22"/>
               </w:rPr>
             </w:pPr>
             <w:r>
               <w:rPr>
                 <w:b/>
                 <w:bCs/>
-              </w:rPr>
+                <w:sz w:val="22"/>
+                <w:szCs w:val="22"/>
+              </w:rPr>
+              <w:lastRenderedPageBreak/>
               <w:t>Code</w:t>
             </w:r>
           </w:p>
@@ -139,12 +224,16 @@
               <w:rPr>
                 <w:b/>
                 <w:bCs/>
+                <w:sz w:val="22"/>
+                <w:szCs w:val="22"/>
               </w:rPr>
             </w:pPr>
             <w:r>
               <w:rPr>
                 <w:b/>
                 <w:bCs/>
+                <w:sz w:val="22"/>
+                <w:szCs w:val="22"/>
               </w:rPr>
               <w:t>Desc</w:t>
             </w:r>
@@ -168,12 +257,16 @@
               <w:rPr>
                 <w:b/>
                 <w:bCs/>
+                <w:sz w:val="22"/>
+                <w:szCs w:val="22"/>
               </w:rPr>
             </w:pPr>
             <w:r>
               <w:rPr>
                 <w:b/>
                 <w:bCs/>
+                <w:sz w:val="22"/>
+                <w:szCs w:val="22"/>
               </w:rPr>
               <w:t>Remarks</w:t>
             </w:r>
@@ -196,27 +289,17 @@
             <w:pPr>
               <w:spacing w:line="278" w:lineRule="auto"/>
               <w:contextualSpacing/>
-            </w:pPr>
-            <w:r>
-              <w:t xml:space="preserve">git config –global </w:t>
-            </w:r>
-            <w:proofErr w:type="spellStart"/>
-            <w:proofErr w:type="gramStart"/>
-            <w:r>
-              <w:t>user.email</w:t>
-            </w:r>
-            <w:proofErr w:type="spellEnd"/>
-            <w:proofErr w:type="gramEnd"/>
-            <w:r>
-              <w:t xml:space="preserve"> “</w:t>
-            </w:r>
-            <w:proofErr w:type="spellStart"/>
-            <w:r>
-              <w:t>wasim</w:t>
-            </w:r>
-            <w:proofErr w:type="spellEnd"/>
-            <w:r>
-              <w:t xml:space="preserve"> khan”</w:t>
+              <w:rPr>
+                <w:sz w:val="22"/>
+                <w:szCs w:val="22"/>
+              </w:rPr>
+            </w:pPr>
+            <w:r>
+              <w:rPr>
+                <w:sz w:val="22"/>
+                <w:szCs w:val="22"/>
+              </w:rPr>
+              <w:t>git config –global user.email “wasim khan”</w:t>
             </w:r>
           </w:p>
         </w:tc>
@@ -235,8 +318,16 @@
             <w:pPr>
               <w:spacing w:line="278" w:lineRule="auto"/>
               <w:contextualSpacing/>
-            </w:pPr>
-            <w:r>
+              <w:rPr>
+                <w:sz w:val="22"/>
+                <w:szCs w:val="22"/>
+              </w:rPr>
+            </w:pPr>
+            <w:r>
+              <w:rPr>
+                <w:sz w:val="22"/>
+                <w:szCs w:val="22"/>
+              </w:rPr>
               <w:t xml:space="preserve">Set the global username </w:t>
             </w:r>
           </w:p>
@@ -256,8 +347,16 @@
             <w:pPr>
               <w:spacing w:line="278" w:lineRule="auto"/>
               <w:contextualSpacing/>
-            </w:pPr>
-            <w:r>
+              <w:rPr>
+                <w:sz w:val="22"/>
+                <w:szCs w:val="22"/>
+              </w:rPr>
+            </w:pPr>
+            <w:r>
+              <w:rPr>
+                <w:sz w:val="22"/>
+                <w:szCs w:val="22"/>
+              </w:rPr>
               <w:t>Configure your identity (one-time, global)</w:t>
             </w:r>
           </w:p>
@@ -279,19 +378,17 @@
             <w:pPr>
               <w:spacing w:line="278" w:lineRule="auto"/>
               <w:contextualSpacing/>
-            </w:pPr>
-            <w:r>
-              <w:t xml:space="preserve">Git config –global </w:t>
-            </w:r>
-            <w:proofErr w:type="spellStart"/>
-            <w:proofErr w:type="gramStart"/>
-            <w:r>
-              <w:t>user.email</w:t>
-            </w:r>
-            <w:proofErr w:type="spellEnd"/>
-            <w:proofErr w:type="gramEnd"/>
-            <w:r>
-              <w:t xml:space="preserve"> “xyz@email.com”</w:t>
+              <w:rPr>
+                <w:sz w:val="22"/>
+                <w:szCs w:val="22"/>
+              </w:rPr>
+            </w:pPr>
+            <w:r>
+              <w:rPr>
+                <w:sz w:val="22"/>
+                <w:szCs w:val="22"/>
+              </w:rPr>
+              <w:t>Git config –global user.email “xyz@email.com”</w:t>
             </w:r>
           </w:p>
         </w:tc>
@@ -310,8 +407,16 @@
             <w:pPr>
               <w:spacing w:line="278" w:lineRule="auto"/>
               <w:contextualSpacing/>
-            </w:pPr>
-            <w:r>
+              <w:rPr>
+                <w:sz w:val="22"/>
+                <w:szCs w:val="22"/>
+              </w:rPr>
+            </w:pPr>
+            <w:r>
+              <w:rPr>
+                <w:sz w:val="22"/>
+                <w:szCs w:val="22"/>
+              </w:rPr>
               <w:t>Set the global email</w:t>
             </w:r>
           </w:p>
@@ -331,8 +436,16 @@
             <w:pPr>
               <w:spacing w:line="278" w:lineRule="auto"/>
               <w:contextualSpacing/>
-            </w:pPr>
-            <w:r>
+              <w:rPr>
+                <w:sz w:val="22"/>
+                <w:szCs w:val="22"/>
+              </w:rPr>
+            </w:pPr>
+            <w:r>
+              <w:rPr>
+                <w:sz w:val="22"/>
+                <w:szCs w:val="22"/>
+              </w:rPr>
               <w:t>One time setup</w:t>
             </w:r>
           </w:p>
@@ -354,19 +467,17 @@
             <w:pPr>
               <w:spacing w:line="278" w:lineRule="auto"/>
               <w:contextualSpacing/>
-            </w:pPr>
-            <w:r>
-              <w:t xml:space="preserve">git config --global </w:t>
-            </w:r>
-            <w:proofErr w:type="spellStart"/>
-            <w:proofErr w:type="gramStart"/>
-            <w:r>
-              <w:t>core.autocrlf</w:t>
-            </w:r>
-            <w:proofErr w:type="spellEnd"/>
-            <w:proofErr w:type="gramEnd"/>
-            <w:r>
-              <w:t xml:space="preserve"> true</w:t>
+              <w:rPr>
+                <w:sz w:val="22"/>
+                <w:szCs w:val="22"/>
+              </w:rPr>
+            </w:pPr>
+            <w:r>
+              <w:rPr>
+                <w:sz w:val="22"/>
+                <w:szCs w:val="22"/>
+              </w:rPr>
+              <w:t>git config --global core.autocrlf true</w:t>
             </w:r>
           </w:p>
         </w:tc>
@@ -385,8 +496,16 @@
             <w:pPr>
               <w:spacing w:line="278" w:lineRule="auto"/>
               <w:contextualSpacing/>
-            </w:pPr>
-            <w:r>
+              <w:rPr>
+                <w:sz w:val="22"/>
+                <w:szCs w:val="22"/>
+              </w:rPr>
+            </w:pPr>
+            <w:r>
+              <w:rPr>
+                <w:sz w:val="22"/>
+                <w:szCs w:val="22"/>
+              </w:rPr>
               <w:t>line-ending differences show up as noisy diffs on every file even when nothing actually changed</w:t>
             </w:r>
           </w:p>
@@ -405,6 +524,10 @@
             <w:pPr>
               <w:spacing w:line="278" w:lineRule="auto"/>
               <w:contextualSpacing/>
+              <w:rPr>
+                <w:sz w:val="22"/>
+                <w:szCs w:val="22"/>
+              </w:rPr>
             </w:pPr>
           </w:p>
         </w:tc>
@@ -425,8 +548,16 @@
             <w:pPr>
               <w:spacing w:line="278" w:lineRule="auto"/>
               <w:contextualSpacing/>
-            </w:pPr>
-            <w:r>
+              <w:rPr>
+                <w:sz w:val="22"/>
+                <w:szCs w:val="22"/>
+              </w:rPr>
+            </w:pPr>
+            <w:r>
+              <w:rPr>
+                <w:sz w:val="22"/>
+                <w:szCs w:val="22"/>
+              </w:rPr>
               <w:t>Git clone url</w:t>
             </w:r>
           </w:p>
@@ -446,8 +577,16 @@
             <w:pPr>
               <w:spacing w:line="278" w:lineRule="auto"/>
               <w:contextualSpacing/>
-            </w:pPr>
-            <w:r>
+              <w:rPr>
+                <w:sz w:val="22"/>
+                <w:szCs w:val="22"/>
+              </w:rPr>
+            </w:pPr>
+            <w:r>
+              <w:rPr>
+                <w:sz w:val="22"/>
+                <w:szCs w:val="22"/>
+              </w:rPr>
               <w:t>Clone the repository</w:t>
             </w:r>
           </w:p>
@@ -467,17 +606,17 @@
             <w:pPr>
               <w:spacing w:line="278" w:lineRule="auto"/>
               <w:contextualSpacing/>
-            </w:pPr>
-            <w:r>
-              <w:t xml:space="preserve">From </w:t>
-            </w:r>
-            <w:proofErr w:type="spellStart"/>
-            <w:r>
-              <w:t>github</w:t>
-            </w:r>
-            <w:proofErr w:type="spellEnd"/>
-            <w:r>
-              <w:t xml:space="preserve"> repo</w:t>
+              <w:rPr>
+                <w:sz w:val="22"/>
+                <w:szCs w:val="22"/>
+              </w:rPr>
+            </w:pPr>
+            <w:r>
+              <w:rPr>
+                <w:sz w:val="22"/>
+                <w:szCs w:val="22"/>
+              </w:rPr>
+              <w:t>From github repo</w:t>
             </w:r>
           </w:p>
         </w:tc>
@@ -498,15 +637,18 @@
             <w:pPr>
               <w:spacing w:line="278" w:lineRule="auto"/>
               <w:contextualSpacing/>
-            </w:pPr>
-            <w:r>
-              <w:t xml:space="preserve">Git </w:t>
-            </w:r>
-            <w:proofErr w:type="gramStart"/>
-            <w:r>
-              <w:t>add .</w:t>
-            </w:r>
-            <w:proofErr w:type="gramEnd"/>
+              <w:rPr>
+                <w:sz w:val="22"/>
+                <w:szCs w:val="22"/>
+              </w:rPr>
+            </w:pPr>
+            <w:r>
+              <w:rPr>
+                <w:sz w:val="22"/>
+                <w:szCs w:val="22"/>
+              </w:rPr>
+              <w:t>Git add .</w:t>
+            </w:r>
           </w:p>
         </w:tc>
         <w:tc>
@@ -524,8 +666,16 @@
             <w:pPr>
               <w:spacing w:line="278" w:lineRule="auto"/>
               <w:contextualSpacing/>
-            </w:pPr>
-            <w:r>
+              <w:rPr>
+                <w:sz w:val="22"/>
+                <w:szCs w:val="22"/>
+              </w:rPr>
+            </w:pPr>
+            <w:r>
+              <w:rPr>
+                <w:sz w:val="22"/>
+                <w:szCs w:val="22"/>
+              </w:rPr>
               <w:t>Add all the files to staging area</w:t>
             </w:r>
           </w:p>
@@ -544,6 +694,10 @@
             <w:pPr>
               <w:spacing w:line="278" w:lineRule="auto"/>
               <w:contextualSpacing/>
+              <w:rPr>
+                <w:sz w:val="22"/>
+                <w:szCs w:val="22"/>
+              </w:rPr>
             </w:pPr>
           </w:p>
         </w:tc>
@@ -564,8 +718,16 @@
             <w:pPr>
               <w:spacing w:line="278" w:lineRule="auto"/>
               <w:contextualSpacing/>
-            </w:pPr>
-            <w:r>
+              <w:rPr>
+                <w:sz w:val="22"/>
+                <w:szCs w:val="22"/>
+              </w:rPr>
+            </w:pPr>
+            <w:r>
+              <w:rPr>
+                <w:sz w:val="22"/>
+                <w:szCs w:val="22"/>
+              </w:rPr>
               <w:t>Git add &lt;filename&gt;</w:t>
             </w:r>
           </w:p>
@@ -585,8 +747,16 @@
             <w:pPr>
               <w:spacing w:line="278" w:lineRule="auto"/>
               <w:contextualSpacing/>
-            </w:pPr>
-            <w:r>
+              <w:rPr>
+                <w:sz w:val="22"/>
+                <w:szCs w:val="22"/>
+              </w:rPr>
+            </w:pPr>
+            <w:r>
+              <w:rPr>
+                <w:sz w:val="22"/>
+                <w:szCs w:val="22"/>
+              </w:rPr>
               <w:t>Add only specific file to staging area by providing the file name</w:t>
             </w:r>
           </w:p>
@@ -605,12 +775,20 @@
             <w:pPr>
               <w:spacing w:line="278" w:lineRule="auto"/>
               <w:contextualSpacing/>
-            </w:pPr>
-          </w:p>
-          <w:p>
-            <w:pPr>
-              <w:spacing w:line="278" w:lineRule="auto"/>
-              <w:contextualSpacing/>
+              <w:rPr>
+                <w:sz w:val="22"/>
+                <w:szCs w:val="22"/>
+              </w:rPr>
+            </w:pPr>
+          </w:p>
+          <w:p>
+            <w:pPr>
+              <w:spacing w:line="278" w:lineRule="auto"/>
+              <w:contextualSpacing/>
+              <w:rPr>
+                <w:sz w:val="22"/>
+                <w:szCs w:val="22"/>
+              </w:rPr>
             </w:pPr>
           </w:p>
         </w:tc>
@@ -631,8 +809,16 @@
             <w:pPr>
               <w:spacing w:line="278" w:lineRule="auto"/>
               <w:contextualSpacing/>
-            </w:pPr>
-            <w:r>
+              <w:rPr>
+                <w:sz w:val="22"/>
+                <w:szCs w:val="22"/>
+              </w:rPr>
+            </w:pPr>
+            <w:r>
+              <w:rPr>
+                <w:sz w:val="22"/>
+                <w:szCs w:val="22"/>
+              </w:rPr>
               <w:t>Git commit -m “&lt;commit msg&gt;”</w:t>
             </w:r>
           </w:p>
@@ -652,8 +838,16 @@
             <w:pPr>
               <w:spacing w:line="278" w:lineRule="auto"/>
               <w:contextualSpacing/>
-            </w:pPr>
-            <w:r>
+              <w:rPr>
+                <w:sz w:val="22"/>
+                <w:szCs w:val="22"/>
+              </w:rPr>
+            </w:pPr>
+            <w:r>
+              <w:rPr>
+                <w:sz w:val="22"/>
+                <w:szCs w:val="22"/>
+              </w:rPr>
               <w:t>Provide commit to local repo like it will create a history to git</w:t>
             </w:r>
           </w:p>
@@ -673,8 +867,16 @@
             <w:pPr>
               <w:spacing w:line="278" w:lineRule="auto"/>
               <w:contextualSpacing/>
-            </w:pPr>
-            <w:r>
+              <w:rPr>
+                <w:sz w:val="22"/>
+                <w:szCs w:val="22"/>
+              </w:rPr>
+            </w:pPr>
+            <w:r>
+              <w:rPr>
+                <w:sz w:val="22"/>
+                <w:szCs w:val="22"/>
+              </w:rPr>
               <w:t>It will not push to remote repo until push</w:t>
             </w:r>
           </w:p>
@@ -696,8 +898,16 @@
             <w:pPr>
               <w:spacing w:line="278" w:lineRule="auto"/>
               <w:contextualSpacing/>
-            </w:pPr>
-            <w:r>
+              <w:rPr>
+                <w:sz w:val="22"/>
+                <w:szCs w:val="22"/>
+              </w:rPr>
+            </w:pPr>
+            <w:r>
+              <w:rPr>
+                <w:sz w:val="22"/>
+                <w:szCs w:val="22"/>
+              </w:rPr>
               <w:t>Git push</w:t>
             </w:r>
           </w:p>
@@ -717,8 +927,16 @@
             <w:pPr>
               <w:spacing w:line="278" w:lineRule="auto"/>
               <w:contextualSpacing/>
-            </w:pPr>
-            <w:r>
+              <w:rPr>
+                <w:sz w:val="22"/>
+                <w:szCs w:val="22"/>
+              </w:rPr>
+            </w:pPr>
+            <w:r>
+              <w:rPr>
+                <w:sz w:val="22"/>
+                <w:szCs w:val="22"/>
+              </w:rPr>
               <w:t>Merge the local changes to remote repo</w:t>
             </w:r>
           </w:p>
@@ -738,8 +956,16 @@
             <w:pPr>
               <w:spacing w:line="278" w:lineRule="auto"/>
               <w:contextualSpacing/>
-            </w:pPr>
-            <w:r>
+              <w:rPr>
+                <w:sz w:val="22"/>
+                <w:szCs w:val="22"/>
+              </w:rPr>
+            </w:pPr>
+            <w:r>
+              <w:rPr>
+                <w:sz w:val="22"/>
+                <w:szCs w:val="22"/>
+              </w:rPr>
               <w:t>Add the changes to remote so that others can see the changes</w:t>
             </w:r>
           </w:p>
@@ -761,9 +987,16 @@
             <w:pPr>
               <w:spacing w:line="278" w:lineRule="auto"/>
               <w:contextualSpacing/>
-            </w:pPr>
-            <w:r>
-              <w:lastRenderedPageBreak/>
+              <w:rPr>
+                <w:sz w:val="22"/>
+                <w:szCs w:val="22"/>
+              </w:rPr>
+            </w:pPr>
+            <w:r>
+              <w:rPr>
+                <w:sz w:val="22"/>
+                <w:szCs w:val="22"/>
+              </w:rPr>
               <w:t>Git push -u origin &lt;branch name&gt;</w:t>
             </w:r>
           </w:p>
@@ -783,8 +1016,16 @@
             <w:pPr>
               <w:spacing w:line="278" w:lineRule="auto"/>
               <w:contextualSpacing/>
-            </w:pPr>
-            <w:r>
+              <w:rPr>
+                <w:sz w:val="22"/>
+                <w:szCs w:val="22"/>
+              </w:rPr>
+            </w:pPr>
+            <w:r>
+              <w:rPr>
+                <w:sz w:val="22"/>
+                <w:szCs w:val="22"/>
+              </w:rPr>
               <w:t>Push the changes to specific branch by providing the branch name</w:t>
             </w:r>
           </w:p>
@@ -804,8 +1045,16 @@
             <w:pPr>
               <w:spacing w:line="278" w:lineRule="auto"/>
               <w:contextualSpacing/>
-            </w:pPr>
-            <w:r>
+              <w:rPr>
+                <w:sz w:val="22"/>
+                <w:szCs w:val="22"/>
+              </w:rPr>
+            </w:pPr>
+            <w:r>
+              <w:rPr>
+                <w:sz w:val="22"/>
+                <w:szCs w:val="22"/>
+              </w:rPr>
               <w:t>Another way to push the changes in branch</w:t>
             </w:r>
           </w:p>
@@ -826,8 +1075,16 @@
             <w:pPr>
               <w:spacing w:line="278" w:lineRule="auto"/>
               <w:contextualSpacing/>
-            </w:pPr>
-            <w:r>
+              <w:rPr>
+                <w:sz w:val="22"/>
+                <w:szCs w:val="22"/>
+              </w:rPr>
+            </w:pPr>
+            <w:r>
+              <w:rPr>
+                <w:sz w:val="22"/>
+                <w:szCs w:val="22"/>
+              </w:rPr>
               <w:t>Git branch</w:t>
             </w:r>
           </w:p>
@@ -846,8 +1103,16 @@
             <w:pPr>
               <w:spacing w:line="278" w:lineRule="auto"/>
               <w:contextualSpacing/>
-            </w:pPr>
-            <w:r>
+              <w:rPr>
+                <w:sz w:val="22"/>
+                <w:szCs w:val="22"/>
+              </w:rPr>
+            </w:pPr>
+            <w:r>
+              <w:rPr>
+                <w:sz w:val="22"/>
+                <w:szCs w:val="22"/>
+              </w:rPr>
               <w:t>List all the branch available in local</w:t>
             </w:r>
           </w:p>
@@ -866,6 +1131,10 @@
             <w:pPr>
               <w:spacing w:line="278" w:lineRule="auto"/>
               <w:contextualSpacing/>
+              <w:rPr>
+                <w:sz w:val="22"/>
+                <w:szCs w:val="22"/>
+              </w:rPr>
             </w:pPr>
           </w:p>
         </w:tc>
@@ -884,11 +1153,23 @@
           <w:p>
             <w:pPr>
               <w:contextualSpacing/>
-            </w:pPr>
-            <w:r>
+              <w:rPr>
+                <w:sz w:val="22"/>
+                <w:szCs w:val="22"/>
+              </w:rPr>
+            </w:pPr>
+            <w:r>
+              <w:rPr>
+                <w:sz w:val="22"/>
+                <w:szCs w:val="22"/>
+              </w:rPr>
               <w:t xml:space="preserve">git </w:t>
             </w:r>
             <w:r>
+              <w:rPr>
+                <w:sz w:val="22"/>
+                <w:szCs w:val="22"/>
+              </w:rPr>
               <w:t>branch -a</w:t>
             </w:r>
           </w:p>
@@ -906,8 +1187,16 @@
           <w:p>
             <w:pPr>
               <w:contextualSpacing/>
-            </w:pPr>
-            <w:r>
+              <w:rPr>
+                <w:sz w:val="22"/>
+                <w:szCs w:val="22"/>
+              </w:rPr>
+            </w:pPr>
+            <w:r>
+              <w:rPr>
+                <w:sz w:val="22"/>
+                <w:szCs w:val="22"/>
+              </w:rPr>
               <w:t>List all the branch (local + remote)</w:t>
             </w:r>
           </w:p>
@@ -925,6 +1214,10 @@
           <w:p>
             <w:pPr>
               <w:contextualSpacing/>
+              <w:rPr>
+                <w:sz w:val="22"/>
+                <w:szCs w:val="22"/>
+              </w:rPr>
             </w:pPr>
           </w:p>
         </w:tc>
@@ -943,11 +1236,23 @@
           <w:p>
             <w:pPr>
               <w:contextualSpacing/>
-            </w:pPr>
-            <w:r>
+              <w:rPr>
+                <w:sz w:val="22"/>
+                <w:szCs w:val="22"/>
+              </w:rPr>
+            </w:pPr>
+            <w:r>
+              <w:rPr>
+                <w:sz w:val="22"/>
+                <w:szCs w:val="22"/>
+              </w:rPr>
               <w:t xml:space="preserve">Git </w:t>
             </w:r>
             <w:r>
+              <w:rPr>
+                <w:sz w:val="22"/>
+                <w:szCs w:val="22"/>
+              </w:rPr>
               <w:t>branch -r</w:t>
             </w:r>
           </w:p>
@@ -965,8 +1270,16 @@
           <w:p>
             <w:pPr>
               <w:contextualSpacing/>
-            </w:pPr>
-            <w:r>
+              <w:rPr>
+                <w:sz w:val="22"/>
+                <w:szCs w:val="22"/>
+              </w:rPr>
+            </w:pPr>
+            <w:r>
+              <w:rPr>
+                <w:sz w:val="22"/>
+                <w:szCs w:val="22"/>
+              </w:rPr>
               <w:t>List branch only remote</w:t>
             </w:r>
           </w:p>
@@ -984,6 +1297,10 @@
           <w:p>
             <w:pPr>
               <w:contextualSpacing/>
+              <w:rPr>
+                <w:sz w:val="22"/>
+                <w:szCs w:val="22"/>
+              </w:rPr>
             </w:pPr>
           </w:p>
         </w:tc>
@@ -1002,8 +1319,16 @@
           <w:p>
             <w:pPr>
               <w:contextualSpacing/>
-            </w:pPr>
-            <w:r>
+              <w:rPr>
+                <w:sz w:val="22"/>
+                <w:szCs w:val="22"/>
+              </w:rPr>
+            </w:pPr>
+            <w:r>
+              <w:rPr>
+                <w:sz w:val="22"/>
+                <w:szCs w:val="22"/>
+              </w:rPr>
               <w:t>Git branch -v</w:t>
             </w:r>
           </w:p>
@@ -1021,8 +1346,16 @@
           <w:p>
             <w:pPr>
               <w:contextualSpacing/>
-            </w:pPr>
-            <w:r>
+              <w:rPr>
+                <w:sz w:val="22"/>
+                <w:szCs w:val="22"/>
+              </w:rPr>
+            </w:pPr>
+            <w:r>
+              <w:rPr>
+                <w:sz w:val="22"/>
+                <w:szCs w:val="22"/>
+              </w:rPr>
               <w:t>See last commit on each branch</w:t>
             </w:r>
           </w:p>
@@ -1040,6 +1373,300 @@
           <w:p>
             <w:pPr>
               <w:contextualSpacing/>
+              <w:rPr>
+                <w:sz w:val="22"/>
+                <w:szCs w:val="22"/>
+              </w:rPr>
+            </w:pPr>
+          </w:p>
+        </w:tc>
+      </w:tr>
+      <w:tr>
+        <w:tc>
+          <w:tcPr>
+            <w:tcW w:w="3256" w:type="dxa"/>
+            <w:tcBorders>
+              <w:top w:val="single" w:sz="4" w:space="0" w:color="auto"/>
+              <w:left w:val="single" w:sz="4" w:space="0" w:color="auto"/>
+              <w:bottom w:val="single" w:sz="4" w:space="0" w:color="auto"/>
+              <w:right w:val="single" w:sz="4" w:space="0" w:color="auto"/>
+            </w:tcBorders>
+          </w:tcPr>
+          <w:p>
+            <w:pPr>
+              <w:contextualSpacing/>
+              <w:rPr>
+                <w:sz w:val="22"/>
+                <w:szCs w:val="22"/>
+              </w:rPr>
+            </w:pPr>
+            <w:r>
+              <w:rPr>
+                <w:sz w:val="22"/>
+                <w:szCs w:val="22"/>
+              </w:rPr>
+              <w:t>Git branch &lt;branch name&gt;</w:t>
+            </w:r>
+          </w:p>
+        </w:tc>
+        <w:tc>
+          <w:tcPr>
+            <w:tcW w:w="2977" w:type="dxa"/>
+            <w:tcBorders>
+              <w:top w:val="single" w:sz="4" w:space="0" w:color="auto"/>
+              <w:left w:val="single" w:sz="4" w:space="0" w:color="auto"/>
+              <w:bottom w:val="single" w:sz="4" w:space="0" w:color="auto"/>
+              <w:right w:val="single" w:sz="4" w:space="0" w:color="auto"/>
+            </w:tcBorders>
+          </w:tcPr>
+          <w:p>
+            <w:pPr>
+              <w:contextualSpacing/>
+              <w:rPr>
+                <w:sz w:val="22"/>
+                <w:szCs w:val="22"/>
+              </w:rPr>
+            </w:pPr>
+            <w:r>
+              <w:rPr>
+                <w:sz w:val="22"/>
+                <w:szCs w:val="22"/>
+              </w:rPr>
+              <w:t>Create branch with given name</w:t>
+            </w:r>
+          </w:p>
+        </w:tc>
+        <w:tc>
+          <w:tcPr>
+            <w:tcW w:w="3117" w:type="dxa"/>
+            <w:tcBorders>
+              <w:top w:val="single" w:sz="4" w:space="0" w:color="auto"/>
+              <w:left w:val="single" w:sz="4" w:space="0" w:color="auto"/>
+              <w:bottom w:val="single" w:sz="4" w:space="0" w:color="auto"/>
+              <w:right w:val="single" w:sz="4" w:space="0" w:color="auto"/>
+            </w:tcBorders>
+          </w:tcPr>
+          <w:p>
+            <w:pPr>
+              <w:contextualSpacing/>
+              <w:rPr>
+                <w:sz w:val="22"/>
+                <w:szCs w:val="22"/>
+              </w:rPr>
+            </w:pPr>
+          </w:p>
+        </w:tc>
+      </w:tr>
+      <w:tr>
+        <w:tc>
+          <w:tcPr>
+            <w:tcW w:w="3256" w:type="dxa"/>
+            <w:tcBorders>
+              <w:top w:val="single" w:sz="4" w:space="0" w:color="auto"/>
+              <w:left w:val="single" w:sz="4" w:space="0" w:color="auto"/>
+              <w:bottom w:val="single" w:sz="4" w:space="0" w:color="auto"/>
+              <w:right w:val="single" w:sz="4" w:space="0" w:color="auto"/>
+            </w:tcBorders>
+          </w:tcPr>
+          <w:p>
+            <w:pPr>
+              <w:contextualSpacing/>
+              <w:rPr>
+                <w:sz w:val="22"/>
+                <w:szCs w:val="22"/>
+              </w:rPr>
+            </w:pPr>
+            <w:r>
+              <w:rPr>
+                <w:sz w:val="22"/>
+                <w:szCs w:val="22"/>
+              </w:rPr>
+              <w:t>Git checkout &lt;branchname&gt;</w:t>
+            </w:r>
+          </w:p>
+        </w:tc>
+        <w:tc>
+          <w:tcPr>
+            <w:tcW w:w="2977" w:type="dxa"/>
+            <w:tcBorders>
+              <w:top w:val="single" w:sz="4" w:space="0" w:color="auto"/>
+              <w:left w:val="single" w:sz="4" w:space="0" w:color="auto"/>
+              <w:bottom w:val="single" w:sz="4" w:space="0" w:color="auto"/>
+              <w:right w:val="single" w:sz="4" w:space="0" w:color="auto"/>
+            </w:tcBorders>
+          </w:tcPr>
+          <w:p>
+            <w:pPr>
+              <w:contextualSpacing/>
+              <w:rPr>
+                <w:sz w:val="22"/>
+                <w:szCs w:val="22"/>
+              </w:rPr>
+            </w:pPr>
+            <w:r>
+              <w:rPr>
+                <w:sz w:val="22"/>
+                <w:szCs w:val="22"/>
+              </w:rPr>
+              <w:t>Switched to that branch</w:t>
+            </w:r>
+          </w:p>
+        </w:tc>
+        <w:tc>
+          <w:tcPr>
+            <w:tcW w:w="3117" w:type="dxa"/>
+            <w:tcBorders>
+              <w:top w:val="single" w:sz="4" w:space="0" w:color="auto"/>
+              <w:left w:val="single" w:sz="4" w:space="0" w:color="auto"/>
+              <w:bottom w:val="single" w:sz="4" w:space="0" w:color="auto"/>
+              <w:right w:val="single" w:sz="4" w:space="0" w:color="auto"/>
+            </w:tcBorders>
+          </w:tcPr>
+          <w:p>
+            <w:pPr>
+              <w:contextualSpacing/>
+              <w:rPr>
+                <w:sz w:val="22"/>
+                <w:szCs w:val="22"/>
+              </w:rPr>
+            </w:pPr>
+          </w:p>
+        </w:tc>
+      </w:tr>
+      <w:tr>
+        <w:tc>
+          <w:tcPr>
+            <w:tcW w:w="3256" w:type="dxa"/>
+            <w:tcBorders>
+              <w:top w:val="single" w:sz="4" w:space="0" w:color="auto"/>
+              <w:left w:val="single" w:sz="4" w:space="0" w:color="auto"/>
+              <w:bottom w:val="single" w:sz="4" w:space="0" w:color="auto"/>
+              <w:right w:val="single" w:sz="4" w:space="0" w:color="auto"/>
+            </w:tcBorders>
+          </w:tcPr>
+          <w:p>
+            <w:pPr>
+              <w:contextualSpacing/>
+              <w:rPr>
+                <w:sz w:val="22"/>
+                <w:szCs w:val="22"/>
+              </w:rPr>
+            </w:pPr>
+            <w:r>
+              <w:rPr>
+                <w:sz w:val="22"/>
+                <w:szCs w:val="22"/>
+              </w:rPr>
+              <w:t>Git checkout -b &lt;branchname&gt;</w:t>
+            </w:r>
+          </w:p>
+        </w:tc>
+        <w:tc>
+          <w:tcPr>
+            <w:tcW w:w="2977" w:type="dxa"/>
+            <w:tcBorders>
+              <w:top w:val="single" w:sz="4" w:space="0" w:color="auto"/>
+              <w:left w:val="single" w:sz="4" w:space="0" w:color="auto"/>
+              <w:bottom w:val="single" w:sz="4" w:space="0" w:color="auto"/>
+              <w:right w:val="single" w:sz="4" w:space="0" w:color="auto"/>
+            </w:tcBorders>
+          </w:tcPr>
+          <w:p>
+            <w:pPr>
+              <w:contextualSpacing/>
+              <w:rPr>
+                <w:sz w:val="22"/>
+                <w:szCs w:val="22"/>
+              </w:rPr>
+            </w:pPr>
+            <w:r>
+              <w:rPr>
+                <w:sz w:val="22"/>
+                <w:szCs w:val="22"/>
+              </w:rPr>
+              <w:t>Crate and switch to that branch</w:t>
+            </w:r>
+          </w:p>
+        </w:tc>
+        <w:tc>
+          <w:tcPr>
+            <w:tcW w:w="3117" w:type="dxa"/>
+            <w:tcBorders>
+              <w:top w:val="single" w:sz="4" w:space="0" w:color="auto"/>
+              <w:left w:val="single" w:sz="4" w:space="0" w:color="auto"/>
+              <w:bottom w:val="single" w:sz="4" w:space="0" w:color="auto"/>
+              <w:right w:val="single" w:sz="4" w:space="0" w:color="auto"/>
+            </w:tcBorders>
+          </w:tcPr>
+          <w:p>
+            <w:pPr>
+              <w:contextualSpacing/>
+              <w:rPr>
+                <w:sz w:val="22"/>
+                <w:szCs w:val="22"/>
+              </w:rPr>
+            </w:pPr>
+          </w:p>
+        </w:tc>
+      </w:tr>
+      <w:tr>
+        <w:tc>
+          <w:tcPr>
+            <w:tcW w:w="3256" w:type="dxa"/>
+            <w:tcBorders>
+              <w:top w:val="single" w:sz="4" w:space="0" w:color="auto"/>
+              <w:left w:val="single" w:sz="4" w:space="0" w:color="auto"/>
+              <w:bottom w:val="single" w:sz="4" w:space="0" w:color="auto"/>
+              <w:right w:val="single" w:sz="4" w:space="0" w:color="auto"/>
+            </w:tcBorders>
+          </w:tcPr>
+          <w:p>
+            <w:pPr>
+              <w:contextualSpacing/>
+              <w:rPr>
+                <w:sz w:val="22"/>
+                <w:szCs w:val="22"/>
+              </w:rPr>
+            </w:pPr>
+          </w:p>
+        </w:tc>
+        <w:tc>
+          <w:tcPr>
+            <w:tcW w:w="2977" w:type="dxa"/>
+            <w:tcBorders>
+              <w:top w:val="single" w:sz="4" w:space="0" w:color="auto"/>
+              <w:left w:val="single" w:sz="4" w:space="0" w:color="auto"/>
+              <w:bottom w:val="single" w:sz="4" w:space="0" w:color="auto"/>
+              <w:right w:val="single" w:sz="4" w:space="0" w:color="auto"/>
+            </w:tcBorders>
+          </w:tcPr>
+          <w:p>
+            <w:pPr>
+              <w:contextualSpacing/>
+              <w:rPr>
+                <w:sz w:val="22"/>
+                <w:szCs w:val="22"/>
+              </w:rPr>
+            </w:pPr>
+          </w:p>
+        </w:tc>
+        <w:tc>
+          <w:tcPr>
+            <w:tcW w:w="3117" w:type="dxa"/>
+            <w:tcBorders>
+              <w:top w:val="single" w:sz="4" w:space="0" w:color="auto"/>
+              <w:left w:val="single" w:sz="4" w:space="0" w:color="auto"/>
+              <w:bottom w:val="single" w:sz="4" w:space="0" w:color="auto"/>
+              <w:right w:val="single" w:sz="4" w:space="0" w:color="auto"/>
+            </w:tcBorders>
+          </w:tcPr>
+          <w:p>
+            <w:pPr>
+              <w:contextualSpacing/>
+              <w:rPr>
+                <w:sz w:val="22"/>
+                <w:szCs w:val="22"/>
+              </w:rPr>
             </w:pPr>
           </w:p>
         </w:tc>
@@ -1049,12 +1676,20 @@
       <w:pPr>
         <w:spacing w:after="0"/>
         <w:contextualSpacing/>
+        <w:rPr>
+          <w:sz w:val="22"/>
+          <w:szCs w:val="22"/>
+        </w:rPr>
       </w:pPr>
     </w:p>
     <w:p>
       <w:pPr>
         <w:spacing w:after="0"/>
         <w:contextualSpacing/>
+        <w:rPr>
+          <w:sz w:val="22"/>
+          <w:szCs w:val="22"/>
+        </w:rPr>
       </w:pPr>
     </w:p>
     <w:sectPr>

</xml_diff>

<commit_message>
delete command for branch added
</commit_message>
<xml_diff>
--- a/Git command.docx
+++ b/Git command.docx
@@ -113,6 +113,7 @@
       </w:pPr>
       <w:r>
         <w:rPr>
+          <w:noProof/>
           <w:sz w:val="22"/>
           <w:szCs w:val="22"/>
         </w:rPr>
@@ -1628,6 +1629,13 @@
                 <w:szCs w:val="22"/>
               </w:rPr>
             </w:pPr>
+            <w:r>
+              <w:rPr>
+                <w:sz w:val="22"/>
+                <w:szCs w:val="22"/>
+              </w:rPr>
+              <w:t>Git branch -d branchname</w:t>
+            </w:r>
           </w:p>
         </w:tc>
         <w:tc>
@@ -1648,6 +1656,89 @@
                 <w:szCs w:val="22"/>
               </w:rPr>
             </w:pPr>
+            <w:r>
+              <w:rPr>
+                <w:sz w:val="22"/>
+                <w:szCs w:val="22"/>
+              </w:rPr>
+              <w:t>Delete the branch name</w:t>
+            </w:r>
+          </w:p>
+        </w:tc>
+        <w:tc>
+          <w:tcPr>
+            <w:tcW w:w="3117" w:type="dxa"/>
+            <w:tcBorders>
+              <w:top w:val="single" w:sz="4" w:space="0" w:color="auto"/>
+              <w:left w:val="single" w:sz="4" w:space="0" w:color="auto"/>
+              <w:bottom w:val="single" w:sz="4" w:space="0" w:color="auto"/>
+              <w:right w:val="single" w:sz="4" w:space="0" w:color="auto"/>
+            </w:tcBorders>
+          </w:tcPr>
+          <w:p>
+            <w:pPr>
+              <w:contextualSpacing/>
+              <w:rPr>
+                <w:sz w:val="22"/>
+                <w:szCs w:val="22"/>
+              </w:rPr>
+            </w:pPr>
+          </w:p>
+        </w:tc>
+      </w:tr>
+      <w:tr>
+        <w:tc>
+          <w:tcPr>
+            <w:tcW w:w="3256" w:type="dxa"/>
+            <w:tcBorders>
+              <w:top w:val="single" w:sz="4" w:space="0" w:color="auto"/>
+              <w:left w:val="single" w:sz="4" w:space="0" w:color="auto"/>
+              <w:bottom w:val="single" w:sz="4" w:space="0" w:color="auto"/>
+              <w:right w:val="single" w:sz="4" w:space="0" w:color="auto"/>
+            </w:tcBorders>
+          </w:tcPr>
+          <w:p>
+            <w:pPr>
+              <w:contextualSpacing/>
+              <w:rPr>
+                <w:sz w:val="22"/>
+                <w:szCs w:val="22"/>
+              </w:rPr>
+            </w:pPr>
+            <w:r>
+              <w:rPr>
+                <w:sz w:val="22"/>
+                <w:szCs w:val="22"/>
+              </w:rPr>
+              <w:t>git push origin --delete feature/login-page</w:t>
+            </w:r>
+          </w:p>
+        </w:tc>
+        <w:tc>
+          <w:tcPr>
+            <w:tcW w:w="2977" w:type="dxa"/>
+            <w:tcBorders>
+              <w:top w:val="single" w:sz="4" w:space="0" w:color="auto"/>
+              <w:left w:val="single" w:sz="4" w:space="0" w:color="auto"/>
+              <w:bottom w:val="single" w:sz="4" w:space="0" w:color="auto"/>
+              <w:right w:val="single" w:sz="4" w:space="0" w:color="auto"/>
+            </w:tcBorders>
+          </w:tcPr>
+          <w:p>
+            <w:pPr>
+              <w:contextualSpacing/>
+              <w:rPr>
+                <w:sz w:val="22"/>
+                <w:szCs w:val="22"/>
+              </w:rPr>
+            </w:pPr>
+            <w:r>
+              <w:rPr>
+                <w:sz w:val="22"/>
+                <w:szCs w:val="22"/>
+              </w:rPr>
+              <w:t>Delete remote branch</w:t>
+            </w:r>
           </w:p>
         </w:tc>
         <w:tc>
@@ -2305,7 +2396,6 @@
   <w:style w:type="character" w:default="1" w:styleId="DefaultParagraphFont">
     <w:name w:val="Default Paragraph Font"/>
     <w:uiPriority w:val="1"/>
-    <w:semiHidden/>
     <w:unhideWhenUsed/>
   </w:style>
   <w:style w:type="table" w:default="1" w:styleId="TableNormal">

</xml_diff>

<commit_message>
checkout to switch command modified
</commit_message>
<xml_diff>
--- a/Git command.docx
+++ b/Git command.docx
@@ -300,41 +300,7 @@
                 <w:sz w:val="22"/>
                 <w:szCs w:val="22"/>
               </w:rPr>
-              <w:t xml:space="preserve">git config –global </w:t>
-            </w:r>
-            <w:proofErr w:type="spellStart"/>
-            <w:proofErr w:type="gramStart"/>
-            <w:r>
-              <w:rPr>
-                <w:sz w:val="22"/>
-                <w:szCs w:val="22"/>
-              </w:rPr>
-              <w:t>user.email</w:t>
-            </w:r>
-            <w:proofErr w:type="spellEnd"/>
-            <w:proofErr w:type="gramEnd"/>
-            <w:r>
-              <w:rPr>
-                <w:sz w:val="22"/>
-                <w:szCs w:val="22"/>
-              </w:rPr>
-              <w:t xml:space="preserve"> “</w:t>
-            </w:r>
-            <w:proofErr w:type="spellStart"/>
-            <w:r>
-              <w:rPr>
-                <w:sz w:val="22"/>
-                <w:szCs w:val="22"/>
-              </w:rPr>
-              <w:t>wasim</w:t>
-            </w:r>
-            <w:proofErr w:type="spellEnd"/>
-            <w:r>
-              <w:rPr>
-                <w:sz w:val="22"/>
-                <w:szCs w:val="22"/>
-              </w:rPr>
-              <w:t xml:space="preserve"> khan”</w:t>
+              <w:t>git config –global user.email “wasim khan”</w:t>
             </w:r>
           </w:p>
         </w:tc>
@@ -423,25 +389,7 @@
                 <w:sz w:val="22"/>
                 <w:szCs w:val="22"/>
               </w:rPr>
-              <w:t xml:space="preserve">Git config –global </w:t>
-            </w:r>
-            <w:proofErr w:type="spellStart"/>
-            <w:proofErr w:type="gramStart"/>
-            <w:r>
-              <w:rPr>
-                <w:sz w:val="22"/>
-                <w:szCs w:val="22"/>
-              </w:rPr>
-              <w:t>user.email</w:t>
-            </w:r>
-            <w:proofErr w:type="spellEnd"/>
-            <w:proofErr w:type="gramEnd"/>
-            <w:r>
-              <w:rPr>
-                <w:sz w:val="22"/>
-                <w:szCs w:val="22"/>
-              </w:rPr>
-              <w:t xml:space="preserve"> “xyz@email.com”</w:t>
+              <w:t>Git config –global user.email “xyz@email.com”</w:t>
             </w:r>
           </w:p>
         </w:tc>
@@ -530,25 +478,7 @@
                 <w:sz w:val="22"/>
                 <w:szCs w:val="22"/>
               </w:rPr>
-              <w:t xml:space="preserve">git config --global </w:t>
-            </w:r>
-            <w:proofErr w:type="spellStart"/>
-            <w:proofErr w:type="gramStart"/>
-            <w:r>
-              <w:rPr>
-                <w:sz w:val="22"/>
-                <w:szCs w:val="22"/>
-              </w:rPr>
-              <w:t>core.autocrlf</w:t>
-            </w:r>
-            <w:proofErr w:type="spellEnd"/>
-            <w:proofErr w:type="gramEnd"/>
-            <w:r>
-              <w:rPr>
-                <w:sz w:val="22"/>
-                <w:szCs w:val="22"/>
-              </w:rPr>
-              <w:t xml:space="preserve"> true</w:t>
+              <w:t>git config --global core.autocrlf true</w:t>
             </w:r>
           </w:p>
         </w:tc>
@@ -687,23 +617,7 @@
                 <w:sz w:val="22"/>
                 <w:szCs w:val="22"/>
               </w:rPr>
-              <w:t xml:space="preserve">From </w:t>
-            </w:r>
-            <w:proofErr w:type="spellStart"/>
-            <w:r>
-              <w:rPr>
-                <w:sz w:val="22"/>
-                <w:szCs w:val="22"/>
-              </w:rPr>
-              <w:t>github</w:t>
-            </w:r>
-            <w:proofErr w:type="spellEnd"/>
-            <w:r>
-              <w:rPr>
-                <w:sz w:val="22"/>
-                <w:szCs w:val="22"/>
-              </w:rPr>
-              <w:t xml:space="preserve"> repo</w:t>
+              <w:t>From github repo</w:t>
             </w:r>
           </w:p>
         </w:tc>
@@ -734,17 +648,8 @@
                 <w:sz w:val="22"/>
                 <w:szCs w:val="22"/>
               </w:rPr>
-              <w:t xml:space="preserve">Git </w:t>
-            </w:r>
-            <w:proofErr w:type="gramStart"/>
-            <w:r>
-              <w:rPr>
-                <w:sz w:val="22"/>
-                <w:szCs w:val="22"/>
-              </w:rPr>
-              <w:t>add .</w:t>
-            </w:r>
-            <w:proofErr w:type="gramEnd"/>
+              <w:t>Git add .</w:t>
+            </w:r>
           </w:p>
         </w:tc>
         <w:tc>
@@ -1577,23 +1482,21 @@
                 <w:sz w:val="22"/>
                 <w:szCs w:val="22"/>
               </w:rPr>
-              <w:t>Git checkout &lt;</w:t>
-            </w:r>
-            <w:proofErr w:type="spellStart"/>
-            <w:r>
-              <w:rPr>
-                <w:sz w:val="22"/>
-                <w:szCs w:val="22"/>
-              </w:rPr>
-              <w:t>branchname</w:t>
-            </w:r>
-            <w:proofErr w:type="spellEnd"/>
-            <w:r>
-              <w:rPr>
-                <w:sz w:val="22"/>
-                <w:szCs w:val="22"/>
-              </w:rPr>
-              <w:t>&gt;</w:t>
+              <w:t xml:space="preserve">Git </w:t>
+            </w:r>
+            <w:r>
+              <w:rPr>
+                <w:sz w:val="22"/>
+                <w:szCs w:val="22"/>
+              </w:rPr>
+              <w:t>switch</w:t>
+            </w:r>
+            <w:r>
+              <w:rPr>
+                <w:sz w:val="22"/>
+                <w:szCs w:val="22"/>
+              </w:rPr>
+              <w:t xml:space="preserve"> &lt;branchname&gt;</w:t>
             </w:r>
           </w:p>
         </w:tc>
@@ -1669,23 +1572,35 @@
                 <w:sz w:val="22"/>
                 <w:szCs w:val="22"/>
               </w:rPr>
-              <w:t>Git checkout -b &lt;</w:t>
-            </w:r>
-            <w:proofErr w:type="spellStart"/>
-            <w:r>
-              <w:rPr>
-                <w:sz w:val="22"/>
-                <w:szCs w:val="22"/>
-              </w:rPr>
-              <w:t>branchname</w:t>
-            </w:r>
-            <w:proofErr w:type="spellEnd"/>
-            <w:r>
-              <w:rPr>
-                <w:sz w:val="22"/>
-                <w:szCs w:val="22"/>
-              </w:rPr>
-              <w:t>&gt;</w:t>
+              <w:t xml:space="preserve">Git </w:t>
+            </w:r>
+            <w:r>
+              <w:rPr>
+                <w:sz w:val="22"/>
+                <w:szCs w:val="22"/>
+              </w:rPr>
+              <w:t xml:space="preserve">switch </w:t>
+            </w:r>
+            <w:r>
+              <w:rPr>
+                <w:sz w:val="22"/>
+                <w:szCs w:val="22"/>
+              </w:rPr>
+              <w:t>-</w:t>
+            </w:r>
+            <w:r>
+              <w:rPr>
+                <w:sz w:val="22"/>
+                <w:szCs w:val="22"/>
+              </w:rPr>
+              <w:t>c</w:t>
+            </w:r>
+            <w:r>
+              <w:rPr>
+                <w:sz w:val="22"/>
+                <w:szCs w:val="22"/>
+              </w:rPr>
+              <w:t xml:space="preserve"> &lt;branchname&gt;</w:t>
             </w:r>
           </w:p>
         </w:tc>
@@ -1761,17 +1676,8 @@
                 <w:sz w:val="22"/>
                 <w:szCs w:val="22"/>
               </w:rPr>
-              <w:t xml:space="preserve">Git branch -d </w:t>
-            </w:r>
-            <w:proofErr w:type="spellStart"/>
-            <w:r>
-              <w:rPr>
-                <w:sz w:val="22"/>
-                <w:szCs w:val="22"/>
-              </w:rPr>
-              <w:t>branchname</w:t>
-            </w:r>
-            <w:proofErr w:type="spellEnd"/>
+              <w:t>Git branch -d branchname</w:t>
+            </w:r>
           </w:p>
         </w:tc>
         <w:tc>

</xml_diff>